<commit_message>
Clarify AI scope: one system bundled with Google Workspace, one purchased separately
Co-Authored-By: Claude Sonnet 5.5 <noreply@anthropic.com>
Claude-Session: https://claude.ai/code/session_018sSEssnHssGnWMVn9wDjgj
</commit_message>
<xml_diff>
--- a/TOR_ศูนย์แพทยศาสตรศึกษา_ปีงบ70.docx
+++ b/TOR_ศูนย์แพทยศาสตรศึกษา_ปีงบ70.docx
@@ -19,13 +19,13 @@
         <w:t xml:space="preserve">(ปีงบประมาณ 70 คือ พ.ศ. 2570: ตุลาคม 2569 – กันยายน 2570)</w:t>
       </w:r>
     </w:p>
-    <w:bookmarkStart w:id="22" w:name="ระบบปญญาประดษฐ-ai-จำนวน-2-ระบบ-ลขสทธรายป"/>
+    <w:bookmarkStart w:id="22" w:name="X245e579d33bf84b712c09b3371c127a660c44ee"/>
     <w:p>
       <w:pPr>
         <w:pStyle w:val="Heading2"/>
       </w:pPr>
       <w:r>
-        <w:t xml:space="preserve">1. ระบบปัญญาประดิษฐ์ (AI) จำนวน 2 ระบบ (ลิขสิทธิ์รายปี)</w:t>
+        <w:t xml:space="preserve">1. ระบบปัญญาประดิษฐ์ (AI) จำนวน 2 ระบบ (จัดซื้อแยก 1 ระบบ และรวมอยู่ในข้อ 2 อีก 1 ระบบ)</w:t>
       </w:r>
     </w:p>
     <w:p>
@@ -46,13 +46,65 @@
         <w:t xml:space="preserve">เพื่อใช้ในการพัฒนาระบบงาน จัดทำเอกสารทางเทคนิค และผลิตสื่อสนับสนุนการให้บริการของศูนย์ฯ</w:t>
       </w:r>
     </w:p>
-    <w:bookmarkStart w:id="20" w:name="ระบบ-ai-ผชวยดานขอมลวชาการ-จำนวน-1-ระบบ"/>
+    <w:p>
+      <w:pPr>
+        <w:pStyle w:val="BodyText"/>
+      </w:pPr>
+      <w:r>
+        <w:t xml:space="preserve">ระบบ AI ตามข้อ 1 ประกอบด้วย 2 ระบบ ดังนี้</w:t>
+      </w:r>
+    </w:p>
+    <w:p>
+      <w:pPr>
+        <w:numPr>
+          <w:ilvl w:val="0"/>
+          <w:numId w:val="1001"/>
+        </w:numPr>
+        <w:pStyle w:val="Compact"/>
+      </w:pPr>
+      <w:r>
+        <w:rPr>
+          <w:bCs/>
+          <w:b/>
+        </w:rPr>
+        <w:t xml:space="preserve">ระบบที่ 1 (AI ด้านข้อมูลวิชาการ):</w:t>
+      </w:r>
+      <w:r>
+        <w:t xml:space="preserve"> </w:t>
+      </w:r>
+      <w:r>
+        <w:t xml:space="preserve">ให้บริการรวมอยู่ในแผน Google Workspace ตามข้อ 2 ไม่คิดค่าบริการแยก</w:t>
+      </w:r>
+    </w:p>
+    <w:p>
+      <w:pPr>
+        <w:numPr>
+          <w:ilvl w:val="0"/>
+          <w:numId w:val="1001"/>
+        </w:numPr>
+        <w:pStyle w:val="Compact"/>
+      </w:pPr>
+      <w:r>
+        <w:rPr>
+          <w:bCs/>
+          <w:b/>
+        </w:rPr>
+        <w:t xml:space="preserve">ระบบที่ 2 (AI พัฒนาสื่อการเรียนการสอน):</w:t>
+      </w:r>
+      <w:r>
+        <w:t xml:space="preserve"> </w:t>
+      </w:r>
+      <w:r>
+        <w:t xml:space="preserve">จัดซื้อเป็นลิขสิทธิ์แยกตามข้อ 1.2</w:t>
+      </w:r>
+    </w:p>
+    <w:bookmarkStart w:id="20" w:name="Xdc86d96f828883e996ad04400694bd35814b346"/>
     <w:p>
       <w:pPr>
         <w:pStyle w:val="Heading3"/>
       </w:pPr>
       <w:r>
-        <w:t xml:space="preserve">1.1 ระบบ AI ผู้ช่วยด้านข้อมูลวิชาการ (จำนวน 1 ระบบ)</w:t>
+        <w:t xml:space="preserve">1.1 ระบบ AI ผู้ช่วยด้านข้อมูลวิชาการ (จำนวน 1 ระบบ) — รวมอยู่ในบริการ Google Workspace ตามข้อ 2</w:t>
       </w:r>
     </w:p>
     <w:p>
@@ -67,7 +119,7 @@
       <w:pPr>
         <w:numPr>
           <w:ilvl w:val="0"/>
-          <w:numId w:val="1001"/>
+          <w:numId w:val="1002"/>
         </w:numPr>
         <w:pStyle w:val="Compact"/>
       </w:pPr>
@@ -79,7 +131,7 @@
       <w:pPr>
         <w:numPr>
           <w:ilvl w:val="0"/>
-          <w:numId w:val="1001"/>
+          <w:numId w:val="1002"/>
         </w:numPr>
         <w:pStyle w:val="Compact"/>
       </w:pPr>
@@ -91,7 +143,7 @@
       <w:pPr>
         <w:numPr>
           <w:ilvl w:val="0"/>
-          <w:numId w:val="1001"/>
+          <w:numId w:val="1002"/>
         </w:numPr>
         <w:pStyle w:val="Compact"/>
       </w:pPr>
@@ -103,7 +155,7 @@
       <w:pPr>
         <w:numPr>
           <w:ilvl w:val="0"/>
-          <w:numId w:val="1001"/>
+          <w:numId w:val="1002"/>
         </w:numPr>
         <w:pStyle w:val="Compact"/>
       </w:pPr>
@@ -115,7 +167,7 @@
       <w:pPr>
         <w:numPr>
           <w:ilvl w:val="0"/>
-          <w:numId w:val="1001"/>
+          <w:numId w:val="1002"/>
         </w:numPr>
         <w:pStyle w:val="Compact"/>
       </w:pPr>
@@ -127,7 +179,7 @@
       <w:pPr>
         <w:numPr>
           <w:ilvl w:val="0"/>
-          <w:numId w:val="1001"/>
+          <w:numId w:val="1002"/>
         </w:numPr>
         <w:pStyle w:val="Compact"/>
       </w:pPr>
@@ -139,7 +191,7 @@
       <w:pPr>
         <w:numPr>
           <w:ilvl w:val="0"/>
-          <w:numId w:val="1001"/>
+          <w:numId w:val="1002"/>
         </w:numPr>
         <w:pStyle w:val="Compact"/>
       </w:pPr>
@@ -151,7 +203,7 @@
       <w:pPr>
         <w:numPr>
           <w:ilvl w:val="0"/>
-          <w:numId w:val="1001"/>
+          <w:numId w:val="1002"/>
         </w:numPr>
         <w:pStyle w:val="Compact"/>
       </w:pPr>
@@ -163,12 +215,12 @@
       <w:pPr>
         <w:numPr>
           <w:ilvl w:val="0"/>
-          <w:numId w:val="1001"/>
-        </w:numPr>
-        <w:pStyle w:val="Compact"/>
-      </w:pPr>
-      <w:r>
-        <w:t xml:space="preserve">ใช้งานได้ 1 สิทธิการใช้งาน สำหรับเจ้าหน้าที่งานเทคโนโลยีสารสนเทศ (IT) ของศูนย์ฯ โดยเฉพาะ โดยต้องเป็นรุ่นที่มีโควตาการใช้งานสูง (แบบ Pro/Plus หรือเทียบเท่า) เป็นระยะเวลา 12 เดือน</w:t>
+          <w:numId w:val="1002"/>
+        </w:numPr>
+        <w:pStyle w:val="Compact"/>
+      </w:pPr>
+      <w:r>
+        <w:t xml:space="preserve">ให้บริการเป็นส่วนหนึ่งของแผน Google Workspace ในข้อ 2 โดยไม่คิดค่าใช้จ่ายเพิ่มเติม ใช้งานได้ 1 สิทธิการใช้งาน สำหรับเจ้าหน้าที่งานเทคโนโลยีสารสนเทศ (IT) ของศูนย์ฯ โดยเฉพาะ เป็นระยะเวลา 12 เดือน</w:t>
       </w:r>
     </w:p>
     <w:bookmarkEnd w:id="20"/>
@@ -193,7 +245,7 @@
       <w:pPr>
         <w:numPr>
           <w:ilvl w:val="0"/>
-          <w:numId w:val="1002"/>
+          <w:numId w:val="1003"/>
         </w:numPr>
         <w:pStyle w:val="Compact"/>
       </w:pPr>
@@ -205,7 +257,7 @@
       <w:pPr>
         <w:numPr>
           <w:ilvl w:val="0"/>
-          <w:numId w:val="1002"/>
+          <w:numId w:val="1003"/>
         </w:numPr>
         <w:pStyle w:val="Compact"/>
       </w:pPr>
@@ -217,7 +269,7 @@
       <w:pPr>
         <w:numPr>
           <w:ilvl w:val="0"/>
-          <w:numId w:val="1002"/>
+          <w:numId w:val="1003"/>
         </w:numPr>
         <w:pStyle w:val="Compact"/>
       </w:pPr>
@@ -229,7 +281,7 @@
       <w:pPr>
         <w:numPr>
           <w:ilvl w:val="0"/>
-          <w:numId w:val="1002"/>
+          <w:numId w:val="1003"/>
         </w:numPr>
         <w:pStyle w:val="Compact"/>
       </w:pPr>
@@ -241,7 +293,7 @@
       <w:pPr>
         <w:numPr>
           <w:ilvl w:val="0"/>
-          <w:numId w:val="1002"/>
+          <w:numId w:val="1003"/>
         </w:numPr>
         <w:pStyle w:val="Compact"/>
       </w:pPr>
@@ -253,7 +305,7 @@
       <w:pPr>
         <w:numPr>
           <w:ilvl w:val="0"/>
-          <w:numId w:val="1002"/>
+          <w:numId w:val="1003"/>
         </w:numPr>
         <w:pStyle w:val="Compact"/>
       </w:pPr>
@@ -265,7 +317,7 @@
       <w:pPr>
         <w:numPr>
           <w:ilvl w:val="0"/>
-          <w:numId w:val="1002"/>
+          <w:numId w:val="1003"/>
         </w:numPr>
         <w:pStyle w:val="Compact"/>
       </w:pPr>
@@ -277,7 +329,7 @@
       <w:pPr>
         <w:numPr>
           <w:ilvl w:val="0"/>
-          <w:numId w:val="1002"/>
+          <w:numId w:val="1003"/>
         </w:numPr>
         <w:pStyle w:val="Compact"/>
       </w:pPr>
@@ -326,7 +378,7 @@
       <w:pPr>
         <w:numPr>
           <w:ilvl w:val="0"/>
-          <w:numId w:val="1003"/>
+          <w:numId w:val="1004"/>
         </w:numPr>
         <w:pStyle w:val="Compact"/>
       </w:pPr>
@@ -338,7 +390,7 @@
       <w:pPr>
         <w:numPr>
           <w:ilvl w:val="0"/>
-          <w:numId w:val="1003"/>
+          <w:numId w:val="1004"/>
         </w:numPr>
         <w:pStyle w:val="Compact"/>
       </w:pPr>
@@ -350,7 +402,19 @@
       <w:pPr>
         <w:numPr>
           <w:ilvl w:val="0"/>
-          <w:numId w:val="1003"/>
+          <w:numId w:val="1004"/>
+        </w:numPr>
+        <w:pStyle w:val="Compact"/>
+      </w:pPr>
+      <w:r>
+        <w:t xml:space="preserve">แผนบริการที่เสนอต้องมีผู้ช่วย AI ระบบ Generative AI (Gemini) รวมอยู่ในแผนโดยไม่มีค่าใช้จ่ายเพิ่ม และต้องมีคุณสมบัติตามข้อ 1.1 (ข้อ 1–8) ครบถ้วน ใช้งานกับ Gmail, Docs, Sheets, Drive และใช้งานผ่านเว็บเบราว์เซอร์ได้</w:t>
+      </w:r>
+    </w:p>
+    <w:p>
+      <w:pPr>
+        <w:numPr>
+          <w:ilvl w:val="0"/>
+          <w:numId w:val="1004"/>
         </w:numPr>
         <w:pStyle w:val="Compact"/>
       </w:pPr>
@@ -362,7 +426,7 @@
       <w:pPr>
         <w:numPr>
           <w:ilvl w:val="0"/>
-          <w:numId w:val="1003"/>
+          <w:numId w:val="1004"/>
         </w:numPr>
         <w:pStyle w:val="Compact"/>
       </w:pPr>
@@ -374,7 +438,7 @@
       <w:pPr>
         <w:numPr>
           <w:ilvl w:val="0"/>
-          <w:numId w:val="1003"/>
+          <w:numId w:val="1004"/>
         </w:numPr>
         <w:pStyle w:val="Compact"/>
       </w:pPr>
@@ -386,7 +450,7 @@
       <w:pPr>
         <w:numPr>
           <w:ilvl w:val="0"/>
-          <w:numId w:val="1003"/>
+          <w:numId w:val="1004"/>
         </w:numPr>
         <w:pStyle w:val="Compact"/>
       </w:pPr>
@@ -398,7 +462,7 @@
       <w:pPr>
         <w:numPr>
           <w:ilvl w:val="0"/>
-          <w:numId w:val="1003"/>
+          <w:numId w:val="1004"/>
         </w:numPr>
         <w:pStyle w:val="Compact"/>
       </w:pPr>
@@ -410,7 +474,7 @@
       <w:pPr>
         <w:numPr>
           <w:ilvl w:val="0"/>
-          <w:numId w:val="1003"/>
+          <w:numId w:val="1004"/>
         </w:numPr>
         <w:pStyle w:val="Compact"/>
       </w:pPr>
@@ -422,7 +486,7 @@
       <w:pPr>
         <w:numPr>
           <w:ilvl w:val="0"/>
-          <w:numId w:val="1003"/>
+          <w:numId w:val="1004"/>
         </w:numPr>
         <w:pStyle w:val="Compact"/>
       </w:pPr>
@@ -434,7 +498,7 @@
       <w:pPr>
         <w:numPr>
           <w:ilvl w:val="0"/>
-          <w:numId w:val="1003"/>
+          <w:numId w:val="1004"/>
         </w:numPr>
         <w:pStyle w:val="Compact"/>
       </w:pPr>
@@ -456,7 +520,7 @@
       <w:pPr>
         <w:numPr>
           <w:ilvl w:val="0"/>
-          <w:numId w:val="1004"/>
+          <w:numId w:val="1005"/>
         </w:numPr>
         <w:pStyle w:val="Compact"/>
       </w:pPr>
@@ -468,7 +532,7 @@
       <w:pPr>
         <w:numPr>
           <w:ilvl w:val="0"/>
-          <w:numId w:val="1004"/>
+          <w:numId w:val="1005"/>
         </w:numPr>
         <w:pStyle w:val="Compact"/>
       </w:pPr>
@@ -480,7 +544,7 @@
       <w:pPr>
         <w:numPr>
           <w:ilvl w:val="0"/>
-          <w:numId w:val="1004"/>
+          <w:numId w:val="1005"/>
         </w:numPr>
         <w:pStyle w:val="Compact"/>
       </w:pPr>
@@ -492,7 +556,7 @@
       <w:pPr>
         <w:numPr>
           <w:ilvl w:val="0"/>
-          <w:numId w:val="1004"/>
+          <w:numId w:val="1005"/>
         </w:numPr>
         <w:pStyle w:val="Compact"/>
       </w:pPr>
@@ -504,7 +568,7 @@
       <w:pPr>
         <w:numPr>
           <w:ilvl w:val="0"/>
-          <w:numId w:val="1004"/>
+          <w:numId w:val="1005"/>
         </w:numPr>
         <w:pStyle w:val="Compact"/>
       </w:pPr>
@@ -516,7 +580,7 @@
       <w:pPr>
         <w:numPr>
           <w:ilvl w:val="0"/>
-          <w:numId w:val="1004"/>
+          <w:numId w:val="1005"/>
         </w:numPr>
         <w:pStyle w:val="Compact"/>
       </w:pPr>
@@ -528,7 +592,7 @@
       <w:pPr>
         <w:numPr>
           <w:ilvl w:val="0"/>
-          <w:numId w:val="1004"/>
+          <w:numId w:val="1005"/>
         </w:numPr>
         <w:pStyle w:val="Compact"/>
       </w:pPr>
@@ -558,7 +622,7 @@
       <w:pPr>
         <w:numPr>
           <w:ilvl w:val="0"/>
-          <w:numId w:val="1005"/>
+          <w:numId w:val="1006"/>
         </w:numPr>
         <w:pStyle w:val="Compact"/>
       </w:pPr>
@@ -570,7 +634,7 @@
       <w:pPr>
         <w:numPr>
           <w:ilvl w:val="0"/>
-          <w:numId w:val="1005"/>
+          <w:numId w:val="1006"/>
         </w:numPr>
         <w:pStyle w:val="Compact"/>
       </w:pPr>
@@ -582,7 +646,7 @@
       <w:pPr>
         <w:numPr>
           <w:ilvl w:val="0"/>
-          <w:numId w:val="1005"/>
+          <w:numId w:val="1006"/>
         </w:numPr>
         <w:pStyle w:val="Compact"/>
       </w:pPr>
@@ -594,7 +658,7 @@
       <w:pPr>
         <w:numPr>
           <w:ilvl w:val="0"/>
-          <w:numId w:val="1005"/>
+          <w:numId w:val="1006"/>
         </w:numPr>
         <w:pStyle w:val="Compact"/>
       </w:pPr>
@@ -606,7 +670,7 @@
       <w:pPr>
         <w:numPr>
           <w:ilvl w:val="0"/>
-          <w:numId w:val="1005"/>
+          <w:numId w:val="1006"/>
         </w:numPr>
         <w:pStyle w:val="Compact"/>
       </w:pPr>
@@ -618,7 +682,7 @@
       <w:pPr>
         <w:numPr>
           <w:ilvl w:val="0"/>
-          <w:numId w:val="1005"/>
+          <w:numId w:val="1006"/>
         </w:numPr>
         <w:pStyle w:val="Compact"/>
       </w:pPr>
@@ -630,7 +694,7 @@
       <w:pPr>
         <w:numPr>
           <w:ilvl w:val="0"/>
-          <w:numId w:val="1005"/>
+          <w:numId w:val="1006"/>
         </w:numPr>
         <w:pStyle w:val="Compact"/>
       </w:pPr>
@@ -642,7 +706,7 @@
       <w:pPr>
         <w:numPr>
           <w:ilvl w:val="0"/>
-          <w:numId w:val="1005"/>
+          <w:numId w:val="1006"/>
         </w:numPr>
         <w:pStyle w:val="Compact"/>
       </w:pPr>
@@ -654,7 +718,7 @@
       <w:pPr>
         <w:numPr>
           <w:ilvl w:val="0"/>
-          <w:numId w:val="1005"/>
+          <w:numId w:val="1006"/>
         </w:numPr>
         <w:pStyle w:val="Compact"/>
       </w:pPr>
@@ -666,7 +730,7 @@
       <w:pPr>
         <w:numPr>
           <w:ilvl w:val="0"/>
-          <w:numId w:val="1005"/>
+          <w:numId w:val="1006"/>
         </w:numPr>
         <w:pStyle w:val="Compact"/>
       </w:pPr>
@@ -678,7 +742,7 @@
       <w:pPr>
         <w:numPr>
           <w:ilvl w:val="0"/>
-          <w:numId w:val="1005"/>
+          <w:numId w:val="1006"/>
         </w:numPr>
         <w:pStyle w:val="Compact"/>
       </w:pPr>
@@ -700,7 +764,7 @@
       <w:pPr>
         <w:numPr>
           <w:ilvl w:val="0"/>
-          <w:numId w:val="1006"/>
+          <w:numId w:val="1007"/>
         </w:numPr>
         <w:pStyle w:val="Compact"/>
       </w:pPr>
@@ -712,7 +776,7 @@
       <w:pPr>
         <w:numPr>
           <w:ilvl w:val="0"/>
-          <w:numId w:val="1006"/>
+          <w:numId w:val="1007"/>
         </w:numPr>
         <w:pStyle w:val="Compact"/>
       </w:pPr>
@@ -724,7 +788,7 @@
       <w:pPr>
         <w:numPr>
           <w:ilvl w:val="0"/>
-          <w:numId w:val="1006"/>
+          <w:numId w:val="1007"/>
         </w:numPr>
         <w:pStyle w:val="Compact"/>
       </w:pPr>
@@ -736,7 +800,7 @@
       <w:pPr>
         <w:numPr>
           <w:ilvl w:val="0"/>
-          <w:numId w:val="1006"/>
+          <w:numId w:val="1007"/>
         </w:numPr>
         <w:pStyle w:val="Compact"/>
       </w:pPr>
@@ -852,6 +916,82 @@
       </w:pPr>
     </w:lvl>
   </w:abstractNum>
+  <w:abstractNum w:abstractNumId="991">
+    <w:nsid w:val="A991"/>
+    <w:multiLevelType w:val="multilevel"/>
+    <w:lvl w:ilvl="0">
+      <w:numFmt w:val="bullet"/>
+      <w:lvlText w:val="•"/>
+      <w:lvlJc w:val="left"/>
+      <w:pPr>
+        <w:ind w:left="720" w:hanging="480"/>
+      </w:pPr>
+    </w:lvl>
+    <w:lvl w:ilvl="1">
+      <w:numFmt w:val="bullet"/>
+      <w:lvlText w:val="–"/>
+      <w:lvlJc w:val="left"/>
+      <w:pPr>
+        <w:ind w:left="1440" w:hanging="480"/>
+      </w:pPr>
+    </w:lvl>
+    <w:lvl w:ilvl="2">
+      <w:numFmt w:val="bullet"/>
+      <w:lvlText w:val="•"/>
+      <w:lvlJc w:val="left"/>
+      <w:pPr>
+        <w:ind w:left="2160" w:hanging="480"/>
+      </w:pPr>
+    </w:lvl>
+    <w:lvl w:ilvl="3">
+      <w:numFmt w:val="bullet"/>
+      <w:lvlText w:val="–"/>
+      <w:lvlJc w:val="left"/>
+      <w:pPr>
+        <w:ind w:left="2880" w:hanging="480"/>
+      </w:pPr>
+    </w:lvl>
+    <w:lvl w:ilvl="4">
+      <w:numFmt w:val="bullet"/>
+      <w:lvlText w:val="•"/>
+      <w:lvlJc w:val="left"/>
+      <w:pPr>
+        <w:ind w:left="3600" w:hanging="480"/>
+      </w:pPr>
+    </w:lvl>
+    <w:lvl w:ilvl="5">
+      <w:numFmt w:val="bullet"/>
+      <w:lvlText w:val="–"/>
+      <w:lvlJc w:val="left"/>
+      <w:pPr>
+        <w:ind w:left="4320" w:hanging="480"/>
+      </w:pPr>
+    </w:lvl>
+    <w:lvl w:ilvl="6">
+      <w:numFmt w:val="bullet"/>
+      <w:lvlText w:val="•"/>
+      <w:lvlJc w:val="left"/>
+      <w:pPr>
+        <w:ind w:left="5040" w:hanging="480"/>
+      </w:pPr>
+    </w:lvl>
+    <w:lvl w:ilvl="7">
+      <w:numFmt w:val="bullet"/>
+      <w:lvlText w:val="–"/>
+      <w:lvlJc w:val="left"/>
+      <w:pPr>
+        <w:ind w:left="5760" w:hanging="480"/>
+      </w:pPr>
+    </w:lvl>
+    <w:lvl w:ilvl="8">
+      <w:numFmt w:val="bullet"/>
+      <w:lvlText w:val="•"/>
+      <w:lvlJc w:val="left"/>
+      <w:pPr>
+        <w:ind w:left="6480" w:hanging="480"/>
+      </w:pPr>
+    </w:lvl>
+  </w:abstractNum>
   <w:abstractNum w:abstractNumId="99411">
     <w:nsid w:val="A99411"/>
     <w:multiLevelType w:val="multilevel"/>
@@ -937,114 +1077,11 @@
       </w:pPr>
     </w:lvl>
   </w:abstractNum>
-  <w:abstractNum w:abstractNumId="991">
-    <w:nsid w:val="A991"/>
-    <w:multiLevelType w:val="multilevel"/>
-    <w:lvl w:ilvl="0">
-      <w:numFmt w:val="bullet"/>
-      <w:lvlText w:val="•"/>
-      <w:lvlJc w:val="left"/>
-      <w:pPr>
-        <w:ind w:left="720" w:hanging="480"/>
-      </w:pPr>
-    </w:lvl>
-    <w:lvl w:ilvl="1">
-      <w:numFmt w:val="bullet"/>
-      <w:lvlText w:val="–"/>
-      <w:lvlJc w:val="left"/>
-      <w:pPr>
-        <w:ind w:left="1440" w:hanging="480"/>
-      </w:pPr>
-    </w:lvl>
-    <w:lvl w:ilvl="2">
-      <w:numFmt w:val="bullet"/>
-      <w:lvlText w:val="•"/>
-      <w:lvlJc w:val="left"/>
-      <w:pPr>
-        <w:ind w:left="2160" w:hanging="480"/>
-      </w:pPr>
-    </w:lvl>
-    <w:lvl w:ilvl="3">
-      <w:numFmt w:val="bullet"/>
-      <w:lvlText w:val="–"/>
-      <w:lvlJc w:val="left"/>
-      <w:pPr>
-        <w:ind w:left="2880" w:hanging="480"/>
-      </w:pPr>
-    </w:lvl>
-    <w:lvl w:ilvl="4">
-      <w:numFmt w:val="bullet"/>
-      <w:lvlText w:val="•"/>
-      <w:lvlJc w:val="left"/>
-      <w:pPr>
-        <w:ind w:left="3600" w:hanging="480"/>
-      </w:pPr>
-    </w:lvl>
-    <w:lvl w:ilvl="5">
-      <w:numFmt w:val="bullet"/>
-      <w:lvlText w:val="–"/>
-      <w:lvlJc w:val="left"/>
-      <w:pPr>
-        <w:ind w:left="4320" w:hanging="480"/>
-      </w:pPr>
-    </w:lvl>
-    <w:lvl w:ilvl="6">
-      <w:numFmt w:val="bullet"/>
-      <w:lvlText w:val="•"/>
-      <w:lvlJc w:val="left"/>
-      <w:pPr>
-        <w:ind w:left="5040" w:hanging="480"/>
-      </w:pPr>
-    </w:lvl>
-    <w:lvl w:ilvl="7">
-      <w:numFmt w:val="bullet"/>
-      <w:lvlText w:val="–"/>
-      <w:lvlJc w:val="left"/>
-      <w:pPr>
-        <w:ind w:left="5760" w:hanging="480"/>
-      </w:pPr>
-    </w:lvl>
-    <w:lvl w:ilvl="8">
-      <w:numFmt w:val="bullet"/>
-      <w:lvlText w:val="•"/>
-      <w:lvlJc w:val="left"/>
-      <w:pPr>
-        <w:ind w:left="6480" w:hanging="480"/>
-      </w:pPr>
-    </w:lvl>
-  </w:abstractNum>
   <w:num w:numId="1000">
     <w:abstractNumId w:val="990"/>
   </w:num>
   <w:num w:numId="1001">
-    <w:abstractNumId w:val="99411"/>
-    <w:lvlOverride w:ilvl="0">
-      <w:startOverride w:val="1"/>
-    </w:lvlOverride>
-    <w:lvlOverride w:ilvl="1">
-      <w:startOverride w:val="1"/>
-    </w:lvlOverride>
-    <w:lvlOverride w:ilvl="2">
-      <w:startOverride w:val="1"/>
-    </w:lvlOverride>
-    <w:lvlOverride w:ilvl="3">
-      <w:startOverride w:val="1"/>
-    </w:lvlOverride>
-    <w:lvlOverride w:ilvl="4">
-      <w:startOverride w:val="1"/>
-    </w:lvlOverride>
-    <w:lvlOverride w:ilvl="5">
-      <w:startOverride w:val="1"/>
-    </w:lvlOverride>
-    <w:lvlOverride w:ilvl="6">
-      <w:startOverride w:val="1"/>
-    </w:lvlOverride>
-    <w:lvlOverride w:ilvl="7">
-      <w:startOverride w:val="1"/>
-    </w:lvlOverride>
-    <w:lvlOverride w:ilvl="8">
-      <w:startOverride w:val="1"/>
-    </w:lvlOverride>
+    <w:abstractNumId w:val="991"/>
   </w:num>
   <w:num w:numId="1002">
     <w:abstractNumId w:val="99411"/>
@@ -1167,6 +1204,36 @@
     </w:lvlOverride>
   </w:num>
   <w:num w:numId="1006">
+    <w:abstractNumId w:val="99411"/>
+    <w:lvlOverride w:ilvl="0">
+      <w:startOverride w:val="1"/>
+    </w:lvlOverride>
+    <w:lvlOverride w:ilvl="1">
+      <w:startOverride w:val="1"/>
+    </w:lvlOverride>
+    <w:lvlOverride w:ilvl="2">
+      <w:startOverride w:val="1"/>
+    </w:lvlOverride>
+    <w:lvlOverride w:ilvl="3">
+      <w:startOverride w:val="1"/>
+    </w:lvlOverride>
+    <w:lvlOverride w:ilvl="4">
+      <w:startOverride w:val="1"/>
+    </w:lvlOverride>
+    <w:lvlOverride w:ilvl="5">
+      <w:startOverride w:val="1"/>
+    </w:lvlOverride>
+    <w:lvlOverride w:ilvl="6">
+      <w:startOverride w:val="1"/>
+    </w:lvlOverride>
+    <w:lvlOverride w:ilvl="7">
+      <w:startOverride w:val="1"/>
+    </w:lvlOverride>
+    <w:lvlOverride w:ilvl="8">
+      <w:startOverride w:val="1"/>
+    </w:lvlOverride>
+  </w:num>
+  <w:num w:numId="1007">
     <w:abstractNumId w:val="991"/>
   </w:num>
 </w:numbering>

</xml_diff>

<commit_message>
Rewrite TOR in Thai government procurement format with specs as annex
Co-Authored-By: Claude Sonnet 5.5 <noreply@anthropic.com>
Claude-Session: https://claude.ai/code/session_018sSEssnHssGnWMVn9wDjgj
</commit_message>
<xml_diff>
--- a/TOR_ศูนย์แพทยศาสตรศึกษา_ปีงบ70.docx
+++ b/TOR_ศูนย์แพทยศาสตรศึกษา_ปีงบ70.docx
@@ -2,30 +2,1895 @@
 <file path=word/document.xml><?xml version="1.0" encoding="utf-8"?>
 <w:document xmlns:w="http://schemas.openxmlformats.org/wordprocessingml/2006/main" xmlns:m="http://schemas.openxmlformats.org/officeDocument/2006/math" xmlns:r="http://schemas.openxmlformats.org/officeDocument/2006/relationships" xmlns:o="urn:schemas-microsoft-com:office:office" xmlns:v="urn:schemas-microsoft-com:vml" xmlns:w10="urn:schemas-microsoft-com:office:word" xmlns:a="http://schemas.openxmlformats.org/drawingml/2006/main" xmlns:pic="http://schemas.openxmlformats.org/drawingml/2006/picture" xmlns:wp="http://schemas.openxmlformats.org/drawingml/2006/wordprocessingDrawing">
   <w:body>
-    <w:bookmarkStart w:id="27" w:name="X66275d39d931411ce53f1b1a52412a2fea0fa1b"/>
+    <w:p>
+      <w:pPr>
+        <w:pStyle w:val="Title"/>
+      </w:pPr>
+      <w:r>
+        <w:t xml:space="preserve">ขอบเขตของงาน</w:t>
+      </w:r>
+      <w:r>
+        <w:t xml:space="preserve"> </w:t>
+      </w:r>
+      <w:r>
+        <w:t xml:space="preserve">(Terms</w:t>
+      </w:r>
+      <w:r>
+        <w:t xml:space="preserve"> </w:t>
+      </w:r>
+      <w:r>
+        <w:t xml:space="preserve">of</w:t>
+      </w:r>
+      <w:r>
+        <w:t xml:space="preserve"> </w:t>
+      </w:r>
+      <w:r>
+        <w:t xml:space="preserve">Reference</w:t>
+      </w:r>
+      <w:r>
+        <w:t xml:space="preserve"> </w:t>
+      </w:r>
+      <w:r>
+        <w:t xml:space="preserve">:</w:t>
+      </w:r>
+      <w:r>
+        <w:t xml:space="preserve"> </w:t>
+      </w:r>
+      <w:r>
+        <w:t xml:space="preserve">TOR)</w:t>
+      </w:r>
+    </w:p>
+    <w:p>
+      <w:pPr>
+        <w:pStyle w:val="Subtitle"/>
+      </w:pPr>
+      <w:r>
+        <w:t xml:space="preserve">โครงการจัดซื้อระบบเทคโนโลยีสารสนเทศ</w:t>
+      </w:r>
+      <w:r>
+        <w:t xml:space="preserve"> </w:t>
+      </w:r>
+      <w:r>
+        <w:t xml:space="preserve">งานไอที</w:t>
+      </w:r>
+      <w:r>
+        <w:t xml:space="preserve"> </w:t>
+      </w:r>
+      <w:r>
+        <w:t xml:space="preserve">ศูนย์แพทยศาสตรศึกษา</w:t>
+      </w:r>
+      <w:r>
+        <w:t xml:space="preserve"> </w:t>
+      </w:r>
+      <w:r>
+        <w:t xml:space="preserve">ประจำปีงบประมาณ</w:t>
+      </w:r>
+      <w:r>
+        <w:t xml:space="preserve"> </w:t>
+      </w:r>
+      <w:r>
+        <w:t xml:space="preserve">พ.ศ.</w:t>
+      </w:r>
+      <w:r>
+        <w:t xml:space="preserve"> </w:t>
+      </w:r>
+      <w:r>
+        <w:t xml:space="preserve">2570</w:t>
+      </w:r>
+    </w:p>
+    <w:p>
+      <w:pPr>
+        <w:pStyle w:val="FirstParagraph"/>
+      </w:pPr>
+      <w:r>
+        <w:rPr>
+          <w:bCs/>
+          <w:b/>
+        </w:rPr>
+        <w:t xml:space="preserve">หน่วยงานเจ้าของโครงการ:</w:t>
+      </w:r>
+      <w:r>
+        <w:t xml:space="preserve"> </w:t>
+      </w:r>
+      <w:r>
+        <w:t xml:space="preserve">ศูนย์แพทยศาสตรศึกษา …………………………………. (ระบุสังกัด)</w:t>
+      </w:r>
+    </w:p>
+    <w:p>
+      <w:pPr>
+        <w:pStyle w:val="BodyText"/>
+      </w:pPr>
+      <w:r>
+        <w:rPr>
+          <w:bCs/>
+          <w:b/>
+        </w:rPr>
+        <w:t xml:space="preserve">อ้างอิงกฎหมาย:</w:t>
+      </w:r>
+      <w:r>
+        <w:t xml:space="preserve"> </w:t>
+      </w:r>
+      <w:r>
+        <w:t xml:space="preserve">พระราชบัญญัติการจัดซื้อจัดจ้างและการบริหารพัสดุภาครัฐ พ.ศ. 2560 และระเบียบกระทรวงการคลังว่าด้วยการจัดซื้อจัดจ้างและการบริหารพัสดุภาครัฐ พ.ศ. 2560 รวมทั้งที่แก้ไขเพิ่มเติม</w:t>
+      </w:r>
+    </w:p>
+    <w:bookmarkStart w:id="20" w:name="ความเปนมา"/>
+    <w:p>
+      <w:pPr>
+        <w:pStyle w:val="Heading2"/>
+      </w:pPr>
+      <w:r>
+        <w:t xml:space="preserve">1. ความเป็นมา</w:t>
+      </w:r>
+    </w:p>
+    <w:p>
+      <w:pPr>
+        <w:pStyle w:val="FirstParagraph"/>
+      </w:pPr>
+      <w:r>
+        <w:t xml:space="preserve">ศูนย์แพทยศาสตรศึกษา มีภารกิจสนับสนุนการจัดการเรียนการสอน การพัฒนาหลักสูตร การผลิตสื่อ และการให้บริการด้านแพทยศาสตรศึกษา โดยปัจจุบันศูนย์ฯ ใช้ระบบบริการดิจิทัลสนับสนุนงาน ได้แก่ ระบบจองห้องเรียนและระบบเบิกยืมอุปกรณ์ ซึ่งพัฒนาด้วย Google Apps Script และ Google Sheets เพื่อให้การดำเนินงานเกิดประสิทธิภาพ ลดภาระงานเอกสาร และพัฒนาการสื่อสารกับผู้ใช้บริการ ศูนย์ฯ จึงมีความจำเป็นต้องจัดหาเครื่องมือและบริการดิจิทัลที่จำเป็นต่อการพัฒนาระบบงาน การผลิตสื่อ การจัดเก็บข้อมูล การเผยแพร่ข้อมูลบนเว็บไซต์ และการสื่อสารผ่านช่องทางไลน์ ประจำปีงบประมาณ พ.ศ. 2570</w:t>
+      </w:r>
+    </w:p>
+    <w:bookmarkEnd w:id="20"/>
+    <w:bookmarkStart w:id="21" w:name="วตถประสงค"/>
+    <w:p>
+      <w:pPr>
+        <w:pStyle w:val="Heading2"/>
+      </w:pPr>
+      <w:r>
+        <w:t xml:space="preserve">2. วัตถุประสงค์</w:t>
+      </w:r>
+    </w:p>
+    <w:p>
+      <w:pPr>
+        <w:pStyle w:val="FirstParagraph"/>
+      </w:pPr>
+      <w:r>
+        <w:t xml:space="preserve">2.1 เพื่อสนับสนุนการพัฒนาระบบงานและการจัดทำข้อมูลวิชาการของศูนย์ฯ ด้วยเครื่องมือปัญญาประดิษฐ์ (AI)</w:t>
+      </w:r>
+    </w:p>
+    <w:p>
+      <w:pPr>
+        <w:pStyle w:val="BodyText"/>
+      </w:pPr>
+      <w:r>
+        <w:t xml:space="preserve">2.2 เพื่อมีบัญชีอีเมลและพื้นที่จัดเก็บข้อมูลบนคลาวด์ของหน่วยงาน สำหรับพัฒนาระบบงานและสมัครใช้บริการภายนอก โดยทำงานร่วมกับระบบที่ใช้อยู่เดิมได้</w:t>
+      </w:r>
+    </w:p>
+    <w:p>
+      <w:pPr>
+        <w:pStyle w:val="BodyText"/>
+      </w:pPr>
+      <w:r>
+        <w:t xml:space="preserve">2.3 เพื่อมีชื่อโดเมนของศูนย์ฯ สำหรับเว็บไซต์และอีเมลที่เป็นทางการ</w:t>
+      </w:r>
+    </w:p>
+    <w:p>
+      <w:pPr>
+        <w:pStyle w:val="BodyText"/>
+      </w:pPr>
+      <w:r>
+        <w:t xml:space="preserve">2.4 เพื่อมีช่องทางสื่อสารประชาสัมพันธ์ผ่าน LINE Official Account และพัฒนา Chatbot เชื่อมต่อกับระบบบริการของศูนย์ฯ</w:t>
+      </w:r>
+    </w:p>
+    <w:bookmarkEnd w:id="21"/>
+    <w:bookmarkStart w:id="22" w:name="คณสมบตของผยนขอเสนอ"/>
+    <w:p>
+      <w:pPr>
+        <w:pStyle w:val="Heading2"/>
+      </w:pPr>
+      <w:r>
+        <w:t xml:space="preserve">3. คุณสมบัติของผู้ยื่นข้อเสนอ</w:t>
+      </w:r>
+    </w:p>
+    <w:p>
+      <w:pPr>
+        <w:pStyle w:val="FirstParagraph"/>
+      </w:pPr>
+      <w:r>
+        <w:t xml:space="preserve">3.1 มีความสามารถตามกฎหมาย</w:t>
+      </w:r>
+    </w:p>
+    <w:p>
+      <w:pPr>
+        <w:pStyle w:val="BodyText"/>
+      </w:pPr>
+      <w:r>
+        <w:t xml:space="preserve">3.2 ไม่เป็นบุคคลล้มละลาย</w:t>
+      </w:r>
+    </w:p>
+    <w:p>
+      <w:pPr>
+        <w:pStyle w:val="BodyText"/>
+      </w:pPr>
+      <w:r>
+        <w:t xml:space="preserve">3.3 ไม่อยู่ระหว่างเลิกกิจการ</w:t>
+      </w:r>
+    </w:p>
+    <w:p>
+      <w:pPr>
+        <w:pStyle w:val="BodyText"/>
+      </w:pPr>
+      <w:r>
+        <w:t xml:space="preserve">3.4 ไม่เป็นบุคคลซึ่งอยู่ระหว่างถูกระงับการยื่นข้อเสนอหรือทำสัญญากับหน่วยงานของรัฐไว้ชั่วคราว เนื่องจากเป็นผู้ที่ไม่ผ่านเกณฑ์การประเมินผลการปฏิบัติงานของผู้ประกอบการ</w:t>
+      </w:r>
+    </w:p>
+    <w:p>
+      <w:pPr>
+        <w:pStyle w:val="BodyText"/>
+      </w:pPr>
+      <w:r>
+        <w:t xml:space="preserve">3.5 ไม่เป็นบุคคลซึ่งถูกระบุชื่อไว้ในบัญชีรายชื่อผู้ทิ้งงานของทางราชการ และได้แจ้งเวียนชื่อแล้ว หรือไม่เป็นบุคคลซึ่งเป็นหุ้นส่วนผู้จัดการ กรรมการผู้จัดการ ผู้บริหาร ผู้มีอำนาจในการดำเนินงานในกิจการของนิติบุคคลนั้นด้วย</w:t>
+      </w:r>
+    </w:p>
+    <w:p>
+      <w:pPr>
+        <w:pStyle w:val="BodyText"/>
+      </w:pPr>
+      <w:r>
+        <w:t xml:space="preserve">3.6 มีคุณสมบัติและไม่มีลักษณะต้องห้ามตามที่คณะกรรมการนโยบายการจัดซื้อจัดจ้างและการบริหารพัสดุภาครัฐกำหนด</w:t>
+      </w:r>
+    </w:p>
+    <w:p>
+      <w:pPr>
+        <w:pStyle w:val="BodyText"/>
+      </w:pPr>
+      <w:r>
+        <w:t xml:space="preserve">3.7 เป็นนิติบุคคลผู้มีอาชีพขายพัสดุหรือให้บริการตามที่จัดหาในครั้งนี้</w:t>
+      </w:r>
+    </w:p>
+    <w:p>
+      <w:pPr>
+        <w:pStyle w:val="BodyText"/>
+      </w:pPr>
+      <w:r>
+        <w:t xml:space="preserve">3.8 ไม่เป็นผู้มีผลประโยชน์ร่วมกันกับผู้ยื่นข้อเสนอรายอื่นที่เข้ายื่นข้อเสนอให้แก่ศูนย์ฯ ณ วันประกาศเชิญชวน หรือไม่เป็นผู้กระทำการอันเป็นการขัดขวางการแข่งขันอย่างเป็นธรรมในการจัดหาครั้งนี้</w:t>
+      </w:r>
+    </w:p>
+    <w:p>
+      <w:pPr>
+        <w:pStyle w:val="BodyText"/>
+      </w:pPr>
+      <w:r>
+        <w:t xml:space="preserve">3.9 ไม่เป็นผู้ได้รับเอกสิทธิ์หรือความคุ้มกัน ซึ่งอาจปฏิเสธไม่ยอมขึ้นศาลไทย เว้นแต่รัฐบาลของผู้ยื่นข้อเสนอได้มีคำสั่งให้สละเอกสิทธิ์และความคุ้มกันเช่นว่านั้น</w:t>
+      </w:r>
+    </w:p>
+    <w:p>
+      <w:pPr>
+        <w:pStyle w:val="BodyText"/>
+      </w:pPr>
+      <w:r>
+        <w:t xml:space="preserve">3.10 ผู้ยื่นข้อเสนอที่ยื่นข้อเสนอในรูปแบบของ</w:t>
+      </w:r>
+      <w:r>
+        <w:t xml:space="preserve"> </w:t>
+      </w:r>
+      <w:r>
+        <w:t xml:space="preserve">“</w:t>
+      </w:r>
+      <w:r>
+        <w:t xml:space="preserve">กิจการร่วมค้า</w:t>
+      </w:r>
+      <w:r>
+        <w:t xml:space="preserve">”</w:t>
+      </w:r>
+      <w:r>
+        <w:t xml:space="preserve"> </w:t>
+      </w:r>
+      <w:r>
+        <w:t xml:space="preserve">ต้องมีคุณสมบัติครบถ้วนตามที่กำหนดไว้ในเอกสารเชิญชวน</w:t>
+      </w:r>
+    </w:p>
+    <w:p>
+      <w:pPr>
+        <w:pStyle w:val="BodyText"/>
+      </w:pPr>
+      <w:r>
+        <w:t xml:space="preserve">3.11 ผู้ยื่นข้อเสนอต้องลงทะเบียนในระบบจัดซื้อจัดจ้างภาครัฐด้วยอิเล็กทรอนิกส์ (e-GP) ของกรมบัญชีกลาง</w:t>
+      </w:r>
+    </w:p>
+    <w:p>
+      <w:pPr>
+        <w:pStyle w:val="BodyText"/>
+      </w:pPr>
+      <w:r>
+        <w:t xml:space="preserve">3.12</w:t>
+      </w:r>
+      <w:r>
+        <w:t xml:space="preserve"> </w:t>
+      </w:r>
+      <w:r>
+        <w:rPr>
+          <w:bCs/>
+          <w:b/>
+        </w:rPr>
+        <w:t xml:space="preserve">คุณสมบัติเฉพาะ (ตามความจำเป็นของรายการ):</w:t>
+      </w:r>
+    </w:p>
+    <w:p>
+      <w:pPr>
+        <w:numPr>
+          <w:ilvl w:val="0"/>
+          <w:numId w:val="1001"/>
+        </w:numPr>
+        <w:pStyle w:val="Compact"/>
+      </w:pPr>
+      <w:r>
+        <w:t xml:space="preserve">รายการที่ 2 (Google Workspace) ผู้ยื่นข้อเสนอต้องเป็นผู้จำหน่ายหรือตัวแทนที่ได้รับการแต่งตั้งจากผู้ผลิตหรือผู้ให้บริการ พร้อมแนบหนังสือแต่งตั้งหรือหนังสือรับรองที่ยังไม่หมดอายุ</w:t>
+      </w:r>
+    </w:p>
+    <w:p>
+      <w:pPr>
+        <w:numPr>
+          <w:ilvl w:val="0"/>
+          <w:numId w:val="1001"/>
+        </w:numPr>
+        <w:pStyle w:val="Compact"/>
+      </w:pPr>
+      <w:r>
+        <w:t xml:space="preserve">รายการที่ 4 (LINE Official Account) ผู้ยื่นข้อเสนอต้องเป็นตัวแทนหรือผู้ให้บริการที่ได้รับอนุญาตจากผู้ให้บริการแพลตฟอร์ม หรือเป็นผู้ให้บริการโดยตรง พร้อมแนบเอกสารรับรอง</w:t>
+      </w:r>
+    </w:p>
+    <w:p>
+      <w:pPr>
+        <w:numPr>
+          <w:ilvl w:val="0"/>
+          <w:numId w:val="1001"/>
+        </w:numPr>
+        <w:pStyle w:val="Compact"/>
+      </w:pPr>
+      <w:r>
+        <w:t xml:space="preserve">รายการที่ 3 (ชื่อโดเมน) ผู้ยื่นข้อเสนอต้องเป็นนายทะเบียนที่ได้รับการรับรองจาก ICANN หรือตัวแทนจำหน่ายของนายทะเบียนดังกล่าว</w:t>
+      </w:r>
+    </w:p>
+    <w:bookmarkEnd w:id="22"/>
+    <w:bookmarkStart w:id="26" w:name="แบบรปรายการหรอคณลกษณะเฉพาะ"/>
+    <w:p>
+      <w:pPr>
+        <w:pStyle w:val="Heading2"/>
+      </w:pPr>
+      <w:r>
+        <w:t xml:space="preserve">4. แบบรูปรายการหรือคุณลักษณะเฉพาะ</w:t>
+      </w:r>
+    </w:p>
+    <w:bookmarkStart w:id="23" w:name="สรปรายการจดหา"/>
+    <w:p>
+      <w:pPr>
+        <w:pStyle w:val="Heading3"/>
+      </w:pPr>
+      <w:r>
+        <w:t xml:space="preserve">4.1 สรุปรายการจัดหา</w:t>
+      </w:r>
+    </w:p>
+    <w:tbl>
+      <w:tblPr>
+        <w:tblStyle w:val="Table"/>
+        <w:tblW w:type="pct" w:w="5000"/>
+        <w:tblLook w:firstRow="1" w:lastRow="0" w:firstColumn="0" w:lastColumn="0" w:noHBand="0" w:noVBand="0" w:val="0020"/>
+        <w:jc w:val="start"/>
+        <w:tblBorders>
+          <w:top w:val="single" w:sz="4" w:color="000000"/>
+          <w:left w:val="single" w:sz="4" w:color="000000"/>
+          <w:bottom w:val="single" w:sz="4" w:color="000000"/>
+          <w:right w:val="single" w:sz="4" w:color="000000"/>
+          <w:insideH w:val="single" w:sz="4" w:color="000000"/>
+          <w:insideV w:val="single" w:sz="4" w:color="000000"/>
+        </w:tblBorders>
+      </w:tblPr>
+      <w:tblGrid>
+        <w:gridCol w:w="825"/>
+        <w:gridCol w:w="4620"/>
+        <w:gridCol w:w="825"/>
+        <w:gridCol w:w="825"/>
+        <w:gridCol w:w="825"/>
+      </w:tblGrid>
+      <w:tr>
+        <w:trPr>
+          <w:tblHeader w:val="true"/>
+        </w:trPr>
+        <w:tc>
+          <w:tcPr/>
+          <w:p>
+            <w:pPr>
+              <w:pStyle w:val="Compact"/>
+              <w:jc w:val="center"/>
+            </w:pPr>
+            <w:r>
+              <w:t xml:space="preserve">ลำดับ</w:t>
+            </w:r>
+          </w:p>
+        </w:tc>
+        <w:tc>
+          <w:tcPr/>
+          <w:p>
+            <w:pPr>
+              <w:pStyle w:val="Compact"/>
+              <w:jc w:val="left"/>
+            </w:pPr>
+            <w:r>
+              <w:t xml:space="preserve">รายการ</w:t>
+            </w:r>
+          </w:p>
+        </w:tc>
+        <w:tc>
+          <w:tcPr/>
+          <w:p>
+            <w:pPr>
+              <w:pStyle w:val="Compact"/>
+              <w:jc w:val="center"/>
+            </w:pPr>
+            <w:r>
+              <w:t xml:space="preserve">จำนวน</w:t>
+            </w:r>
+          </w:p>
+        </w:tc>
+        <w:tc>
+          <w:tcPr/>
+          <w:p>
+            <w:pPr>
+              <w:pStyle w:val="Compact"/>
+              <w:jc w:val="center"/>
+            </w:pPr>
+            <w:r>
+              <w:t xml:space="preserve">หน่วย</w:t>
+            </w:r>
+          </w:p>
+        </w:tc>
+        <w:tc>
+          <w:tcPr/>
+          <w:p>
+            <w:pPr>
+              <w:pStyle w:val="Compact"/>
+              <w:jc w:val="center"/>
+            </w:pPr>
+            <w:r>
+              <w:t xml:space="preserve">ระยะเวลาใช้งาน</w:t>
+            </w:r>
+          </w:p>
+        </w:tc>
+      </w:tr>
+      <w:tr>
+        <w:tc>
+          <w:tcPr/>
+          <w:p>
+            <w:pPr>
+              <w:pStyle w:val="Compact"/>
+              <w:jc w:val="center"/>
+            </w:pPr>
+            <w:r>
+              <w:t xml:space="preserve">1</w:t>
+            </w:r>
+          </w:p>
+        </w:tc>
+        <w:tc>
+          <w:tcPr/>
+          <w:p>
+            <w:pPr>
+              <w:pStyle w:val="Compact"/>
+              <w:jc w:val="left"/>
+            </w:pPr>
+            <w:r>
+              <w:t xml:space="preserve">ระบบปัญญาประดิษฐ์ (AI) จำนวน 2 ระบบ</w:t>
+            </w:r>
+          </w:p>
+        </w:tc>
+        <w:tc>
+          <w:tcPr/>
+          <w:p>
+            <w:pPr>
+              <w:pStyle w:val="Compact"/>
+              <w:jc w:val="center"/>
+            </w:pPr>
+            <w:r>
+              <w:t xml:space="preserve">2</w:t>
+            </w:r>
+          </w:p>
+        </w:tc>
+        <w:tc>
+          <w:tcPr/>
+          <w:p>
+            <w:pPr>
+              <w:pStyle w:val="Compact"/>
+              <w:jc w:val="center"/>
+            </w:pPr>
+            <w:r>
+              <w:t xml:space="preserve">ระบบ</w:t>
+            </w:r>
+          </w:p>
+        </w:tc>
+        <w:tc>
+          <w:tcPr/>
+          <w:p>
+            <w:pPr>
+              <w:pStyle w:val="Compact"/>
+              <w:jc w:val="center"/>
+            </w:pPr>
+            <w:r>
+              <w:t xml:space="preserve">12 เดือน</w:t>
+            </w:r>
+          </w:p>
+        </w:tc>
+      </w:tr>
+      <w:tr>
+        <w:tc>
+          <w:tcPr/>
+          <w:p>
+            <w:pPr>
+              <w:pStyle w:val="Compact"/>
+            </w:pPr>
+          </w:p>
+        </w:tc>
+        <w:tc>
+          <w:tcPr/>
+          <w:p>
+            <w:pPr>
+              <w:pStyle w:val="Compact"/>
+              <w:jc w:val="left"/>
+            </w:pPr>
+            <w:r>
+              <w:t xml:space="preserve">1.1 AI ด้านข้อมูลวิชาการ (รวมอยู่ในรายการที่ 2 ไม่คิดค่าบริการแยก)</w:t>
+            </w:r>
+          </w:p>
+        </w:tc>
+        <w:tc>
+          <w:tcPr/>
+          <w:p>
+            <w:pPr>
+              <w:pStyle w:val="Compact"/>
+              <w:jc w:val="center"/>
+            </w:pPr>
+            <w:r>
+              <w:t xml:space="preserve">1</w:t>
+            </w:r>
+          </w:p>
+        </w:tc>
+        <w:tc>
+          <w:tcPr/>
+          <w:p>
+            <w:pPr>
+              <w:pStyle w:val="Compact"/>
+              <w:jc w:val="center"/>
+            </w:pPr>
+            <w:r>
+              <w:t xml:space="preserve">สิทธิ</w:t>
+            </w:r>
+          </w:p>
+        </w:tc>
+        <w:tc>
+          <w:tcPr/>
+          <w:p>
+            <w:pPr>
+              <w:pStyle w:val="Compact"/>
+              <w:jc w:val="center"/>
+            </w:pPr>
+            <w:r>
+              <w:t xml:space="preserve">12 เดือน</w:t>
+            </w:r>
+          </w:p>
+        </w:tc>
+      </w:tr>
+      <w:tr>
+        <w:tc>
+          <w:tcPr/>
+          <w:p>
+            <w:pPr>
+              <w:pStyle w:val="Compact"/>
+            </w:pPr>
+          </w:p>
+        </w:tc>
+        <w:tc>
+          <w:tcPr/>
+          <w:p>
+            <w:pPr>
+              <w:pStyle w:val="Compact"/>
+              <w:jc w:val="left"/>
+            </w:pPr>
+            <w:r>
+              <w:t xml:space="preserve">1.2 AI พัฒนาสื่อการเรียนการสอน (จัดซื้อแยก)</w:t>
+            </w:r>
+          </w:p>
+        </w:tc>
+        <w:tc>
+          <w:tcPr/>
+          <w:p>
+            <w:pPr>
+              <w:pStyle w:val="Compact"/>
+              <w:jc w:val="center"/>
+            </w:pPr>
+            <w:r>
+              <w:t xml:space="preserve">1</w:t>
+            </w:r>
+          </w:p>
+        </w:tc>
+        <w:tc>
+          <w:tcPr/>
+          <w:p>
+            <w:pPr>
+              <w:pStyle w:val="Compact"/>
+              <w:jc w:val="center"/>
+            </w:pPr>
+            <w:r>
+              <w:t xml:space="preserve">สิทธิ</w:t>
+            </w:r>
+          </w:p>
+        </w:tc>
+        <w:tc>
+          <w:tcPr/>
+          <w:p>
+            <w:pPr>
+              <w:pStyle w:val="Compact"/>
+              <w:jc w:val="center"/>
+            </w:pPr>
+            <w:r>
+              <w:t xml:space="preserve">12 เดือน</w:t>
+            </w:r>
+          </w:p>
+        </w:tc>
+      </w:tr>
+      <w:tr>
+        <w:tc>
+          <w:tcPr/>
+          <w:p>
+            <w:pPr>
+              <w:pStyle w:val="Compact"/>
+              <w:jc w:val="center"/>
+            </w:pPr>
+            <w:r>
+              <w:t xml:space="preserve">2</w:t>
+            </w:r>
+          </w:p>
+        </w:tc>
+        <w:tc>
+          <w:tcPr/>
+          <w:p>
+            <w:pPr>
+              <w:pStyle w:val="Compact"/>
+              <w:jc w:val="left"/>
+            </w:pPr>
+            <w:r>
+              <w:t xml:space="preserve">ระบบอีเมลและพื้นที่จัดเก็บข้อมูลบนคลาวด์ (Google Workspace)</w:t>
+            </w:r>
+          </w:p>
+        </w:tc>
+        <w:tc>
+          <w:tcPr/>
+          <w:p>
+            <w:pPr>
+              <w:pStyle w:val="Compact"/>
+              <w:jc w:val="center"/>
+            </w:pPr>
+            <w:r>
+              <w:t xml:space="preserve">1</w:t>
+            </w:r>
+          </w:p>
+        </w:tc>
+        <w:tc>
+          <w:tcPr/>
+          <w:p>
+            <w:pPr>
+              <w:pStyle w:val="Compact"/>
+              <w:jc w:val="center"/>
+            </w:pPr>
+            <w:r>
+              <w:t xml:space="preserve">ผู้ใช้</w:t>
+            </w:r>
+          </w:p>
+        </w:tc>
+        <w:tc>
+          <w:tcPr/>
+          <w:p>
+            <w:pPr>
+              <w:pStyle w:val="Compact"/>
+              <w:jc w:val="center"/>
+            </w:pPr>
+            <w:r>
+              <w:t xml:space="preserve">12 เดือน</w:t>
+            </w:r>
+          </w:p>
+        </w:tc>
+      </w:tr>
+      <w:tr>
+        <w:tc>
+          <w:tcPr/>
+          <w:p>
+            <w:pPr>
+              <w:pStyle w:val="Compact"/>
+              <w:jc w:val="center"/>
+            </w:pPr>
+            <w:r>
+              <w:t xml:space="preserve">3</w:t>
+            </w:r>
+          </w:p>
+        </w:tc>
+        <w:tc>
+          <w:tcPr/>
+          <w:p>
+            <w:pPr>
+              <w:pStyle w:val="Compact"/>
+              <w:jc w:val="left"/>
+            </w:pPr>
+            <w:r>
+              <w:t xml:space="preserve">จดทะเบียนชื่อโดเมน (Domain Name)</w:t>
+            </w:r>
+          </w:p>
+        </w:tc>
+        <w:tc>
+          <w:tcPr/>
+          <w:p>
+            <w:pPr>
+              <w:pStyle w:val="Compact"/>
+              <w:jc w:val="center"/>
+            </w:pPr>
+            <w:r>
+              <w:t xml:space="preserve">1</w:t>
+            </w:r>
+          </w:p>
+        </w:tc>
+        <w:tc>
+          <w:tcPr/>
+          <w:p>
+            <w:pPr>
+              <w:pStyle w:val="Compact"/>
+              <w:jc w:val="center"/>
+            </w:pPr>
+            <w:r>
+              <w:t xml:space="preserve">ชื่อ</w:t>
+            </w:r>
+          </w:p>
+        </w:tc>
+        <w:tc>
+          <w:tcPr/>
+          <w:p>
+            <w:pPr>
+              <w:pStyle w:val="Compact"/>
+              <w:jc w:val="center"/>
+            </w:pPr>
+            <w:r>
+              <w:t xml:space="preserve">ไม่น้อยกว่า 1 ปี</w:t>
+            </w:r>
+          </w:p>
+        </w:tc>
+      </w:tr>
+      <w:tr>
+        <w:tc>
+          <w:tcPr/>
+          <w:p>
+            <w:pPr>
+              <w:pStyle w:val="Compact"/>
+              <w:jc w:val="center"/>
+            </w:pPr>
+            <w:r>
+              <w:t xml:space="preserve">4</w:t>
+            </w:r>
+          </w:p>
+        </w:tc>
+        <w:tc>
+          <w:tcPr/>
+          <w:p>
+            <w:pPr>
+              <w:pStyle w:val="Compact"/>
+              <w:jc w:val="left"/>
+            </w:pPr>
+            <w:r>
+              <w:t xml:space="preserve">ระบบ LINE Official Account และ Chatbot (Messaging API)</w:t>
+            </w:r>
+          </w:p>
+        </w:tc>
+        <w:tc>
+          <w:tcPr/>
+          <w:p>
+            <w:pPr>
+              <w:pStyle w:val="Compact"/>
+              <w:jc w:val="center"/>
+            </w:pPr>
+            <w:r>
+              <w:t xml:space="preserve">1</w:t>
+            </w:r>
+          </w:p>
+        </w:tc>
+        <w:tc>
+          <w:tcPr/>
+          <w:p>
+            <w:pPr>
+              <w:pStyle w:val="Compact"/>
+              <w:jc w:val="center"/>
+            </w:pPr>
+            <w:r>
+              <w:t xml:space="preserve">บัญชี</w:t>
+            </w:r>
+          </w:p>
+        </w:tc>
+        <w:tc>
+          <w:tcPr/>
+          <w:p>
+            <w:pPr>
+              <w:pStyle w:val="Compact"/>
+              <w:jc w:val="center"/>
+            </w:pPr>
+            <w:r>
+              <w:t xml:space="preserve">12 เดือน</w:t>
+            </w:r>
+          </w:p>
+        </w:tc>
+      </w:tr>
+    </w:tbl>
+    <w:bookmarkEnd w:id="23"/>
+    <w:bookmarkStart w:id="24" w:name="รายละเอยดคณลกษณะเฉพาะ"/>
+    <w:p>
+      <w:pPr>
+        <w:pStyle w:val="Heading3"/>
+      </w:pPr>
+      <w:r>
+        <w:t xml:space="preserve">4.2 รายละเอียดคุณลักษณะเฉพาะ</w:t>
+      </w:r>
+    </w:p>
+    <w:p>
+      <w:pPr>
+        <w:pStyle w:val="FirstParagraph"/>
+      </w:pPr>
+      <w:r>
+        <w:t xml:space="preserve">ให้เป็นไปตามภาคผนวก ก. แนบท้ายขอบเขตของงานฉบับนี้ ซึ่งถือเป็นส่วนหนึ่งของขอบเขตของงาน</w:t>
+      </w:r>
+    </w:p>
+    <w:bookmarkEnd w:id="24"/>
+    <w:bookmarkStart w:id="25" w:name="การระบชอผลตภณฑ"/>
+    <w:p>
+      <w:pPr>
+        <w:pStyle w:val="Heading3"/>
+      </w:pPr>
+      <w:r>
+        <w:t xml:space="preserve">4.3 การระบุชื่อผลิตภัณฑ์</w:t>
+      </w:r>
+    </w:p>
+    <w:p>
+      <w:pPr>
+        <w:pStyle w:val="FirstParagraph"/>
+      </w:pPr>
+      <w:r>
+        <w:t xml:space="preserve">คุณลักษณะเฉพาะนี้กำหนดโดยไม่ระบุยี่ห้อ เว้นแต่รายการที่ 2 (Google Workspace) และรายการที่ 4 (LINE Official Account) ซึ่งมีความจำเป็นต้องระบุเนื่องจาก</w:t>
+      </w:r>
+    </w:p>
+    <w:p>
+      <w:pPr>
+        <w:numPr>
+          <w:ilvl w:val="0"/>
+          <w:numId w:val="1002"/>
+        </w:numPr>
+        <w:pStyle w:val="Compact"/>
+      </w:pPr>
+      <w:r>
+        <w:rPr>
+          <w:bCs/>
+          <w:b/>
+        </w:rPr>
+        <w:t xml:space="preserve">รายการที่ 2:</w:t>
+      </w:r>
+      <w:r>
+        <w:t xml:space="preserve"> </w:t>
+      </w:r>
+      <w:r>
+        <w:t xml:space="preserve">ศูนย์ฯ มีระบบงานที่พัฒนาด้วย Google Apps Script และ Google Sheets ใช้งานอยู่แล้ว (ระบบจองห้องเรียน ระบบเบิกยืมอุปกรณ์) การใช้บริการอื่นจะทำให้ระบบเดิมใช้งานร่วมกันไม่ได้ ต้องพัฒนาใหม่ และมีค่าใช้จ่ายเพิ่ม</w:t>
+      </w:r>
+    </w:p>
+    <w:p>
+      <w:pPr>
+        <w:numPr>
+          <w:ilvl w:val="0"/>
+          <w:numId w:val="1002"/>
+        </w:numPr>
+        <w:pStyle w:val="Compact"/>
+      </w:pPr>
+      <w:r>
+        <w:rPr>
+          <w:bCs/>
+          <w:b/>
+        </w:rPr>
+        <w:t xml:space="preserve">รายการที่ 4:</w:t>
+      </w:r>
+      <w:r>
+        <w:t xml:space="preserve"> </w:t>
+      </w:r>
+      <w:r>
+        <w:t xml:space="preserve">LINE เป็นช่องทางสื่อสารที่กลุ่มผู้ใช้บริการของศูนย์ฯ ใช้งานอยู่แล้ว และเป็นแพลตฟอร์มที่รองรับการพัฒนา Chatbot ผ่าน Messaging API ตามที่ศูนย์ฯ ต้องการ</w:t>
+      </w:r>
+    </w:p>
+    <w:p>
+      <w:pPr>
+        <w:pStyle w:val="FirstParagraph"/>
+      </w:pPr>
+      <w:r>
+        <w:t xml:space="preserve">ทั้งนี้ ผู้ยื่นข้อเสนอสามารถเสนอผลิตภัณฑ์ที่มีคุณสมบัติเทียบเท่าหรือดีกว่าได้ สำหรับรายการที่ไม่ได้ระบุผลิตภัณฑ์</w:t>
+      </w:r>
+    </w:p>
+    <w:bookmarkEnd w:id="25"/>
+    <w:bookmarkEnd w:id="26"/>
+    <w:bookmarkStart w:id="27" w:name="ระยะเวลาและสถานทสงมอบ"/>
+    <w:p>
+      <w:pPr>
+        <w:pStyle w:val="Heading2"/>
+      </w:pPr>
+      <w:r>
+        <w:t xml:space="preserve">5. ระยะเวลาและสถานที่ส่งมอบ</w:t>
+      </w:r>
+    </w:p>
+    <w:p>
+      <w:pPr>
+        <w:pStyle w:val="FirstParagraph"/>
+      </w:pPr>
+      <w:r>
+        <w:t xml:space="preserve">5.1 ส่งมอบภายใน …….. วัน นับถัดจากวันลงนามในสัญญา หรือวันที่ได้รับหนังสือแจ้งให้ส่งมอบ</w:t>
+      </w:r>
+    </w:p>
+    <w:p>
+      <w:pPr>
+        <w:pStyle w:val="BodyText"/>
+      </w:pPr>
+      <w:r>
+        <w:t xml:space="preserve">5.2 การส่งมอบ คือ การจัดให้ศูนย์ฯ สามารถใช้บริการได้จริงทุกรายการ พร้อมส่งมอบข้อมูลบัญชี รหัสผ่าน และสิทธิ์ผู้ดูแลระบบ ให้แก่ผู้ตรวจรับ</w:t>
+      </w:r>
+    </w:p>
+    <w:p>
+      <w:pPr>
+        <w:pStyle w:val="BodyText"/>
+      </w:pPr>
+      <w:r>
+        <w:t xml:space="preserve">5.3 สถานที่ส่งมอบ: ศูนย์แพทยศาสตรศึกษา …………………………………. หรือส่งมอบทางอิเล็กทรอนิกส์ตามที่ศูนย์ฯ กำหนด</w:t>
+      </w:r>
+    </w:p>
+    <w:p>
+      <w:pPr>
+        <w:pStyle w:val="BodyText"/>
+      </w:pPr>
+      <w:r>
+        <w:t xml:space="preserve">5.4 ระยะเวลาใช้งานเริ่มนับตั้งแต่วันที่ตรวจรับและเปิดใช้บริการได้ถูกต้องครบถ้วน</w:t>
+      </w:r>
+    </w:p>
+    <w:bookmarkEnd w:id="27"/>
+    <w:bookmarkStart w:id="28" w:name="วงเงนงบประมาณและราคากลาง"/>
+    <w:p>
+      <w:pPr>
+        <w:pStyle w:val="Heading2"/>
+      </w:pPr>
+      <w:r>
+        <w:t xml:space="preserve">6. วงเงินงบประมาณและราคากลาง</w:t>
+      </w:r>
+    </w:p>
+    <w:p>
+      <w:pPr>
+        <w:pStyle w:val="FirstParagraph"/>
+      </w:pPr>
+      <w:r>
+        <w:t xml:space="preserve">6.1 วงเงินงบประมาณ รวมทั้งสิ้น ……………….. บาท (…………………………………) รวมภาษีมูลค่าเพิ่มและค่าใช้จ่ายอื่นทั้งปวง จากงบประมาณรายจ่ายประจำปีงบประมาณ พ.ศ. 2570 หมวด ………………………. (ตรวจสอบหมวดรายจ่ายกับงานการเงินและพัสดุ)</w:t>
+      </w:r>
+    </w:p>
+    <w:p>
+      <w:pPr>
+        <w:pStyle w:val="BodyText"/>
+      </w:pPr>
+      <w:r>
+        <w:t xml:space="preserve">6.2 ราคากลาง ……………….. บาท ตามที่คณะกรรมการกำหนดราคากลางได้กำหนดไว้ (แนบตารางแสดงวงเงินงบประมาณและรายละเอียดราคากลาง)</w:t>
+      </w:r>
+    </w:p>
+    <w:tbl>
+      <w:tblPr>
+        <w:tblStyle w:val="Table"/>
+        <w:tblW w:type="auto" w:w="0"/>
+        <w:tblLook w:firstRow="1" w:lastRow="0" w:firstColumn="0" w:lastColumn="0" w:noHBand="0" w:noVBand="0" w:val="0020"/>
+        <w:jc w:val="start"/>
+        <w:tblBorders>
+          <w:top w:val="single" w:sz="4" w:color="000000"/>
+          <w:left w:val="single" w:sz="4" w:color="000000"/>
+          <w:bottom w:val="single" w:sz="4" w:color="000000"/>
+          <w:right w:val="single" w:sz="4" w:color="000000"/>
+          <w:insideH w:val="single" w:sz="4" w:color="000000"/>
+          <w:insideV w:val="single" w:sz="4" w:color="000000"/>
+        </w:tblBorders>
+      </w:tblPr>
+      <w:tblGrid>
+        <w:gridCol w:w="1584"/>
+        <w:gridCol w:w="1584"/>
+        <w:gridCol w:w="1584"/>
+        <w:gridCol w:w="1584"/>
+        <w:gridCol w:w="1584"/>
+      </w:tblGrid>
+      <w:tr>
+        <w:trPr>
+          <w:tblHeader w:val="true"/>
+        </w:trPr>
+        <w:tc>
+          <w:tcPr/>
+          <w:p>
+            <w:pPr>
+              <w:pStyle w:val="Compact"/>
+              <w:jc w:val="center"/>
+            </w:pPr>
+            <w:r>
+              <w:t xml:space="preserve">ลำดับ</w:t>
+            </w:r>
+          </w:p>
+        </w:tc>
+        <w:tc>
+          <w:tcPr/>
+          <w:p>
+            <w:pPr>
+              <w:pStyle w:val="Compact"/>
+              <w:jc w:val="left"/>
+            </w:pPr>
+            <w:r>
+              <w:t xml:space="preserve">รายการ</w:t>
+            </w:r>
+          </w:p>
+        </w:tc>
+        <w:tc>
+          <w:tcPr/>
+          <w:p>
+            <w:pPr>
+              <w:pStyle w:val="Compact"/>
+              <w:jc w:val="center"/>
+            </w:pPr>
+            <w:r>
+              <w:t xml:space="preserve">จำนวน</w:t>
+            </w:r>
+          </w:p>
+        </w:tc>
+        <w:tc>
+          <w:tcPr/>
+          <w:p>
+            <w:pPr>
+              <w:pStyle w:val="Compact"/>
+              <w:jc w:val="center"/>
+            </w:pPr>
+            <w:r>
+              <w:t xml:space="preserve">ราคาต่อหน่วย (บาท)</w:t>
+            </w:r>
+          </w:p>
+        </w:tc>
+        <w:tc>
+          <w:tcPr/>
+          <w:p>
+            <w:pPr>
+              <w:pStyle w:val="Compact"/>
+              <w:jc w:val="center"/>
+            </w:pPr>
+            <w:r>
+              <w:t xml:space="preserve">รวมเป็นเงิน (บาท)</w:t>
+            </w:r>
+          </w:p>
+        </w:tc>
+      </w:tr>
+      <w:tr>
+        <w:tc>
+          <w:tcPr/>
+          <w:p>
+            <w:pPr>
+              <w:pStyle w:val="Compact"/>
+              <w:jc w:val="center"/>
+            </w:pPr>
+            <w:r>
+              <w:t xml:space="preserve">1</w:t>
+            </w:r>
+          </w:p>
+        </w:tc>
+        <w:tc>
+          <w:tcPr/>
+          <w:p>
+            <w:pPr>
+              <w:pStyle w:val="Compact"/>
+              <w:jc w:val="left"/>
+            </w:pPr>
+            <w:r>
+              <w:t xml:space="preserve">AI พัฒนาสื่อการเรียนการสอน</w:t>
+            </w:r>
+          </w:p>
+        </w:tc>
+        <w:tc>
+          <w:tcPr/>
+          <w:p>
+            <w:pPr>
+              <w:pStyle w:val="Compact"/>
+              <w:jc w:val="center"/>
+            </w:pPr>
+            <w:r>
+              <w:t xml:space="preserve">1</w:t>
+            </w:r>
+          </w:p>
+        </w:tc>
+        <w:tc>
+          <w:tcPr/>
+          <w:p>
+            <w:pPr>
+              <w:pStyle w:val="Compact"/>
+            </w:pPr>
+          </w:p>
+        </w:tc>
+        <w:tc>
+          <w:tcPr/>
+          <w:p>
+            <w:pPr>
+              <w:pStyle w:val="Compact"/>
+            </w:pPr>
+          </w:p>
+        </w:tc>
+      </w:tr>
+      <w:tr>
+        <w:tc>
+          <w:tcPr/>
+          <w:p>
+            <w:pPr>
+              <w:pStyle w:val="Compact"/>
+              <w:jc w:val="center"/>
+            </w:pPr>
+            <w:r>
+              <w:t xml:space="preserve">2</w:t>
+            </w:r>
+          </w:p>
+        </w:tc>
+        <w:tc>
+          <w:tcPr/>
+          <w:p>
+            <w:pPr>
+              <w:pStyle w:val="Compact"/>
+              <w:jc w:val="left"/>
+            </w:pPr>
+            <w:r>
+              <w:t xml:space="preserve">Google Workspace (รวม AI ด้านวิชาการ)</w:t>
+            </w:r>
+          </w:p>
+        </w:tc>
+        <w:tc>
+          <w:tcPr/>
+          <w:p>
+            <w:pPr>
+              <w:pStyle w:val="Compact"/>
+              <w:jc w:val="center"/>
+            </w:pPr>
+            <w:r>
+              <w:t xml:space="preserve">1</w:t>
+            </w:r>
+          </w:p>
+        </w:tc>
+        <w:tc>
+          <w:tcPr/>
+          <w:p>
+            <w:pPr>
+              <w:pStyle w:val="Compact"/>
+            </w:pPr>
+          </w:p>
+        </w:tc>
+        <w:tc>
+          <w:tcPr/>
+          <w:p>
+            <w:pPr>
+              <w:pStyle w:val="Compact"/>
+            </w:pPr>
+          </w:p>
+        </w:tc>
+      </w:tr>
+      <w:tr>
+        <w:tc>
+          <w:tcPr/>
+          <w:p>
+            <w:pPr>
+              <w:pStyle w:val="Compact"/>
+              <w:jc w:val="center"/>
+            </w:pPr>
+            <w:r>
+              <w:t xml:space="preserve">3</w:t>
+            </w:r>
+          </w:p>
+        </w:tc>
+        <w:tc>
+          <w:tcPr/>
+          <w:p>
+            <w:pPr>
+              <w:pStyle w:val="Compact"/>
+              <w:jc w:val="left"/>
+            </w:pPr>
+            <w:r>
+              <w:t xml:space="preserve">จดทะเบียนชื่อโดเมน</w:t>
+            </w:r>
+          </w:p>
+        </w:tc>
+        <w:tc>
+          <w:tcPr/>
+          <w:p>
+            <w:pPr>
+              <w:pStyle w:val="Compact"/>
+              <w:jc w:val="center"/>
+            </w:pPr>
+            <w:r>
+              <w:t xml:space="preserve">1</w:t>
+            </w:r>
+          </w:p>
+        </w:tc>
+        <w:tc>
+          <w:tcPr/>
+          <w:p>
+            <w:pPr>
+              <w:pStyle w:val="Compact"/>
+            </w:pPr>
+          </w:p>
+        </w:tc>
+        <w:tc>
+          <w:tcPr/>
+          <w:p>
+            <w:pPr>
+              <w:pStyle w:val="Compact"/>
+            </w:pPr>
+          </w:p>
+        </w:tc>
+      </w:tr>
+      <w:tr>
+        <w:tc>
+          <w:tcPr/>
+          <w:p>
+            <w:pPr>
+              <w:pStyle w:val="Compact"/>
+              <w:jc w:val="center"/>
+            </w:pPr>
+            <w:r>
+              <w:t xml:space="preserve">4</w:t>
+            </w:r>
+          </w:p>
+        </w:tc>
+        <w:tc>
+          <w:tcPr/>
+          <w:p>
+            <w:pPr>
+              <w:pStyle w:val="Compact"/>
+              <w:jc w:val="left"/>
+            </w:pPr>
+            <w:r>
+              <w:t xml:space="preserve">LINE Official Account</w:t>
+            </w:r>
+          </w:p>
+        </w:tc>
+        <w:tc>
+          <w:tcPr/>
+          <w:p>
+            <w:pPr>
+              <w:pStyle w:val="Compact"/>
+              <w:jc w:val="center"/>
+            </w:pPr>
+            <w:r>
+              <w:t xml:space="preserve">1</w:t>
+            </w:r>
+          </w:p>
+        </w:tc>
+        <w:tc>
+          <w:tcPr/>
+          <w:p>
+            <w:pPr>
+              <w:pStyle w:val="Compact"/>
+            </w:pPr>
+          </w:p>
+        </w:tc>
+        <w:tc>
+          <w:tcPr/>
+          <w:p>
+            <w:pPr>
+              <w:pStyle w:val="Compact"/>
+            </w:pPr>
+          </w:p>
+        </w:tc>
+      </w:tr>
+      <w:tr>
+        <w:tc>
+          <w:tcPr/>
+          <w:p>
+            <w:pPr>
+              <w:pStyle w:val="Compact"/>
+            </w:pPr>
+          </w:p>
+        </w:tc>
+        <w:tc>
+          <w:tcPr/>
+          <w:p>
+            <w:pPr>
+              <w:pStyle w:val="Compact"/>
+              <w:jc w:val="left"/>
+            </w:pPr>
+            <w:r>
+              <w:rPr>
+                <w:bCs/>
+                <w:b/>
+              </w:rPr>
+              <w:t xml:space="preserve">รวมทั้งสิ้น</w:t>
+            </w:r>
+          </w:p>
+        </w:tc>
+        <w:tc>
+          <w:tcPr/>
+          <w:p>
+            <w:pPr>
+              <w:pStyle w:val="Compact"/>
+            </w:pPr>
+          </w:p>
+        </w:tc>
+        <w:tc>
+          <w:tcPr/>
+          <w:p>
+            <w:pPr>
+              <w:pStyle w:val="Compact"/>
+            </w:pPr>
+          </w:p>
+        </w:tc>
+        <w:tc>
+          <w:tcPr/>
+          <w:p>
+            <w:pPr>
+              <w:pStyle w:val="Compact"/>
+            </w:pPr>
+          </w:p>
+        </w:tc>
+      </w:tr>
+    </w:tbl>
+    <w:p>
+      <w:pPr>
+        <w:pStyle w:val="BodyText"/>
+      </w:pPr>
+      <w:r>
+        <w:t xml:space="preserve">6.3 การเสนอราคา ให้เสนอราคาเป็นเงินบาท รวมภาษีมูลค่าเพิ่มและค่าใช้จ่ายอื่นทุกประการ ผู้ยื่นข้อเสนอต้องไม่คิดค่าธรรมเนียมการชำระเงินต่างประเทศหรือส่วนต่างอัตราแลกเปลี่ยนเพิ่มเติมจากราคาที่เสนอ</w:t>
+      </w:r>
+    </w:p>
+    <w:bookmarkEnd w:id="28"/>
+    <w:bookmarkStart w:id="29" w:name="หลกเกณฑการพจารณาขอเสนอ"/>
+    <w:p>
+      <w:pPr>
+        <w:pStyle w:val="Heading2"/>
+      </w:pPr>
+      <w:r>
+        <w:t xml:space="preserve">7. หลักเกณฑ์การพิจารณาข้อเสนอ</w:t>
+      </w:r>
+    </w:p>
+    <w:p>
+      <w:pPr>
+        <w:pStyle w:val="FirstParagraph"/>
+      </w:pPr>
+      <w:r>
+        <w:t xml:space="preserve">7.1 วิธีการจัดหา: [ ] วิธีเฉพาะเจาะจง [ ] วิธีประกวดราคาอิเล็กทรอนิกส์ (e-bidding) [ ] วิธีตลาดอิเล็กทรอนิกส์ (e-market) (เลือกตามวงเงินและประเภทรายการ ตาม พ.ร.บ. การจัดซื้อจัดจ้างฯ พ.ศ. 2560)</w:t>
+      </w:r>
+    </w:p>
+    <w:p>
+      <w:pPr>
+        <w:pStyle w:val="BodyText"/>
+      </w:pPr>
+      <w:r>
+        <w:t xml:space="preserve">7.2 หลักเกณฑ์การพิจารณา: พิจารณาโดยใช้เกณฑ์ราคา โดยพิจารณาจากราคารวมต่ำสุด ผู้ยื่นข้อเสนอที่เสนอราคาต่ำสุดต้องมีคุณลักษณะเฉพาะครบถ้วนตามที่กำหนดไว้ในภาคผนวก ก.</w:t>
+      </w:r>
+    </w:p>
+    <w:p>
+      <w:pPr>
+        <w:pStyle w:val="BodyText"/>
+      </w:pPr>
+      <w:r>
+        <w:t xml:space="preserve">7.3 กรณีแบ่งซื้อเป็นรายการ ศูนย์ฯ ขอสงวนสิทธิ์ในการพิจารณาและทำสัญญาแยกตามรายการ (ดูข้อ 13.4)</w:t>
+      </w:r>
+    </w:p>
+    <w:bookmarkEnd w:id="29"/>
+    <w:bookmarkStart w:id="30" w:name="เอกสารทผยนขอเสนอตองยน"/>
+    <w:p>
+      <w:pPr>
+        <w:pStyle w:val="Heading2"/>
+      </w:pPr>
+      <w:r>
+        <w:t xml:space="preserve">8. เอกสารที่ผู้ยื่นข้อเสนอต้องยื่น</w:t>
+      </w:r>
+    </w:p>
+    <w:p>
+      <w:pPr>
+        <w:pStyle w:val="FirstParagraph"/>
+      </w:pPr>
+      <w:r>
+        <w:t xml:space="preserve">8.1 เอกสารตามที่กำหนดในเอกสารเชิญชวน (หนังสือรับรองนิติบุคคล บัญชีผู้ถือหุ้น หนังสือมอบอำนาจ เป็นต้น)</w:t>
+      </w:r>
+    </w:p>
+    <w:p>
+      <w:pPr>
+        <w:pStyle w:val="BodyText"/>
+      </w:pPr>
+      <w:r>
+        <w:t xml:space="preserve">8.2 เอกสารข้อมูลผลิตภัณฑ์ (catalog) หรือเอกสารจากผู้ให้บริการ ที่แสดงว่าข้อเสนอมีคุณสมบัติครบตามภาคผนวก ก. โดยระบุข้อที่ตรงกันให้ชัดเจน</w:t>
+      </w:r>
+    </w:p>
+    <w:p>
+      <w:pPr>
+        <w:pStyle w:val="BodyText"/>
+      </w:pPr>
+      <w:r>
+        <w:t xml:space="preserve">8.3 หนังสือแต่งตั้งตัวแทนจำหน่าย หรือหนังสือรับรองจากผู้ผลิตหรือผู้ให้บริการ ตามข้อ 3.12</w:t>
+      </w:r>
+    </w:p>
+    <w:p>
+      <w:pPr>
+        <w:pStyle w:val="BodyText"/>
+      </w:pPr>
+      <w:r>
+        <w:t xml:space="preserve">8.4 ใบเสนอราคา ที่แสดงรายการ จำนวน ราคาต่อหน่วย และราคารวม</w:t>
+      </w:r>
+    </w:p>
+    <w:bookmarkEnd w:id="30"/>
+    <w:bookmarkStart w:id="31" w:name="การตรวจรบ"/>
+    <w:p>
+      <w:pPr>
+        <w:pStyle w:val="Heading2"/>
+      </w:pPr>
+      <w:r>
+        <w:t xml:space="preserve">9. การตรวจรับ</w:t>
+      </w:r>
+    </w:p>
+    <w:p>
+      <w:pPr>
+        <w:pStyle w:val="FirstParagraph"/>
+      </w:pPr>
+      <w:r>
+        <w:t xml:space="preserve">9.1 คณะกรรมการตรวจรับพัสดุจะตรวจรับเมื่อ ผู้ขายได้ส่งมอบและเปิดใช้บริการครบทุกรายการ ถูกต้องตามคุณลักษณะเฉพาะในภาคผนวก ก. โดยตรวจสอบจากการใช้งานจริง</w:t>
+      </w:r>
+    </w:p>
+    <w:p>
+      <w:pPr>
+        <w:pStyle w:val="BodyText"/>
+      </w:pPr>
+      <w:r>
+        <w:t xml:space="preserve">9.2 กรณีส่งมอบไม่ครบหรือไม่ถูกต้อง ผู้ขายต้องแก้ไขให้ถูกต้องภายใน …….. วัน นับถัดจากวันที่ได้รับแจ้ง</w:t>
+      </w:r>
+    </w:p>
+    <w:bookmarkEnd w:id="31"/>
+    <w:bookmarkStart w:id="32" w:name="การจายเงน"/>
+    <w:p>
+      <w:pPr>
+        <w:pStyle w:val="Heading2"/>
+      </w:pPr>
+      <w:r>
+        <w:t xml:space="preserve">10. การจ่ายเงิน</w:t>
+      </w:r>
+    </w:p>
+    <w:p>
+      <w:pPr>
+        <w:pStyle w:val="FirstParagraph"/>
+      </w:pPr>
+      <w:r>
+        <w:t xml:space="preserve">10.1 ศูนย์ฯ จะชำระเงินให้ผู้ขายเต็มจำนวนในงวดเดียว หลังจากคณะกรรมการตรวจรับพัสดุได้ตรวจรับถูกต้องครบถ้วนแล้ว ภายใน 30 วัน นับถัดจากวันที่ศูนย์ฯ ได้รับใบแจ้งหนี้หรือใบกำกับภาษีถูกต้อง</w:t>
+      </w:r>
+    </w:p>
+    <w:p>
+      <w:pPr>
+        <w:pStyle w:val="BodyText"/>
+      </w:pPr>
+      <w:r>
+        <w:t xml:space="preserve">10.2 ศูนย์ฯ ไม่ชำระเงินล่วงหน้าก่อนการส่งมอบและตรวจรับ</w:t>
+      </w:r>
+    </w:p>
+    <w:bookmarkEnd w:id="32"/>
+    <w:bookmarkStart w:id="33" w:name="อตราคาปรบ"/>
+    <w:p>
+      <w:pPr>
+        <w:pStyle w:val="Heading2"/>
+      </w:pPr>
+      <w:r>
+        <w:t xml:space="preserve">11. อัตราค่าปรับ</w:t>
+      </w:r>
+    </w:p>
+    <w:p>
+      <w:pPr>
+        <w:pStyle w:val="FirstParagraph"/>
+      </w:pPr>
+      <w:r>
+        <w:t xml:space="preserve">11.1 กรณีผู้ขายส่งมอบเกินกำหนดเวลา ศูนย์ฯ จะปรับเป็นรายวันในอัตราร้อยละ 0.20 ของราคาพัสดุที่ยังไม่ได้รับมอบ แต่ต้องไม่ต่ำกว่าวันละ 100 บาท นับถัดจากวันที่ครบกำหนดจนถึงวันที่ส่งมอบครบถ้วน</w:t>
+      </w:r>
+    </w:p>
+    <w:p>
+      <w:pPr>
+        <w:pStyle w:val="BodyText"/>
+      </w:pPr>
+      <w:r>
+        <w:t xml:space="preserve">11.2 การปรับและการบอกเลิกสัญญา ให้เป็นไปตามระเบียบและแบบสัญญาตามที่กรมบัญชีกลางกำหนด</w:t>
+      </w:r>
+    </w:p>
+    <w:bookmarkEnd w:id="33"/>
+    <w:bookmarkStart w:id="34" w:name="การรบประกนและการสนบสนน"/>
+    <w:p>
+      <w:pPr>
+        <w:pStyle w:val="Heading2"/>
+      </w:pPr>
+      <w:r>
+        <w:t xml:space="preserve">12. การรับประกันและการสนับสนุน</w:t>
+      </w:r>
+    </w:p>
+    <w:p>
+      <w:pPr>
+        <w:pStyle w:val="FirstParagraph"/>
+      </w:pPr>
+      <w:r>
+        <w:t xml:space="preserve">12.1 ผู้ขายรับประกันให้บริการใช้งานได้ตามคุณลักษณะเฉพาะ ตลอดระยะเวลาใช้งาน 12 เดือน</w:t>
+      </w:r>
+    </w:p>
+    <w:p>
+      <w:pPr>
+        <w:pStyle w:val="BodyText"/>
+      </w:pPr>
+      <w:r>
+        <w:t xml:space="preserve">12.2 หากบริการหยุดชะงักหรือใช้งานไม่ได้อันเนื่องจากสาเหตุฝั่งผู้ให้บริการหรือผู้ขาย ผู้ขายต้องดำเนินการแก้ไขหรือประสานงานกับผู้ให้บริการ โดยแจ้งตอบรับภายใน 1 วันทำการ และขยายระยะเวลาใช้งานชดเชยให้เท่ากับระยะเวลาที่ใช้งานไม่ได้ หรือคืนเงินตามสัดส่วน</w:t>
+      </w:r>
+    </w:p>
+    <w:p>
+      <w:pPr>
+        <w:pStyle w:val="BodyText"/>
+      </w:pPr>
+      <w:r>
+        <w:t xml:space="preserve">12.3 ผู้ขายต้องจัดช่องทางติดต่อขอรับการสนับสนุน (โทรศัพท์ อีเมล หรือไลน์) ในวันและเวลาทำการ</w:t>
+      </w:r>
+    </w:p>
+    <w:p>
+      <w:pPr>
+        <w:pStyle w:val="BodyText"/>
+      </w:pPr>
+      <w:r>
+        <w:t xml:space="preserve">12.4 ผู้ขายต้องแจ้งเตือนศูนย์ฯ ล่วงหน้าไม่น้อยกว่า 60 วัน ก่อนวันสิ้นสุดระยะเวลาใช้งาน เพื่อการต่ออายุ</w:t>
+      </w:r>
+    </w:p>
+    <w:bookmarkEnd w:id="34"/>
+    <w:bookmarkStart w:id="35" w:name="ขอสงวนสทธ"/>
+    <w:p>
+      <w:pPr>
+        <w:pStyle w:val="Heading2"/>
+      </w:pPr>
+      <w:r>
+        <w:t xml:space="preserve">13. ข้อสงวนสิทธิ์</w:t>
+      </w:r>
+    </w:p>
+    <w:p>
+      <w:pPr>
+        <w:pStyle w:val="FirstParagraph"/>
+      </w:pPr>
+      <w:r>
+        <w:t xml:space="preserve">13.1 ศูนย์ฯ ขอสงวนสิทธิ์ในการยกเลิกการจัดหา หากไม่ได้รับอนุมัติหรือไม่ได้รับจัดสรรงบประมาณ</w:t>
+      </w:r>
+    </w:p>
+    <w:p>
+      <w:pPr>
+        <w:pStyle w:val="BodyText"/>
+      </w:pPr>
+      <w:r>
+        <w:t xml:space="preserve">13.2 ศูนย์ฯ ขอสงวนสิทธิ์ที่จะไม่รับข้อเสนอ ไม่รับราคา หรือไม่ทำสัญญา หากข้อเสนอไม่ถูกต้องตามเงื่อนไข หรือมีเหตุอันควรสงสัยว่าผู้ยื่นข้อเสนอมีผลประโยชน์ร่วมกัน</w:t>
+      </w:r>
+    </w:p>
+    <w:p>
+      <w:pPr>
+        <w:pStyle w:val="BodyText"/>
+      </w:pPr>
+      <w:r>
+        <w:t xml:space="preserve">13.3 กรณีที่ผู้ให้บริการเปลี่ยนแปลงแผนบริการ ราคา หรือเงื่อนไข ระหว่างอายุสัญญา ผู้ขายต้องรักษาคุณลักษณะเฉพาะที่เสนอไว้ตามสัญญาให้ครบถ้วนโดยไม่คิดค่าใช้จ่ายเพิ่ม</w:t>
+      </w:r>
+    </w:p>
+    <w:p>
+      <w:pPr>
+        <w:pStyle w:val="BodyText"/>
+      </w:pPr>
+      <w:r>
+        <w:t xml:space="preserve">13.4 ศูนย์ฯ ขอสงวนสิทธิ์ในการพิจารณาแยกรายการ หรือเลือกซื้อเฉพาะบางรายการได้ ตามความเหมาะสมและวงเงินงบประมาณ</w:t>
+      </w:r>
+    </w:p>
+    <w:bookmarkEnd w:id="35"/>
+    <w:bookmarkStart w:id="36" w:name="ขอมลสวนบคคลและความมนคงปลอดภย"/>
+    <w:p>
+      <w:pPr>
+        <w:pStyle w:val="Heading2"/>
+      </w:pPr>
+      <w:r>
+        <w:t xml:space="preserve">14. ข้อมูลส่วนบุคคลและความมั่นคงปลอดภัย</w:t>
+      </w:r>
+    </w:p>
+    <w:p>
+      <w:pPr>
+        <w:pStyle w:val="FirstParagraph"/>
+      </w:pPr>
+      <w:r>
+        <w:t xml:space="preserve">14.1 ผู้ขายต้องปฏิบัติตามพระราชบัญญัติคุ้มครองข้อมูลส่วนบุคคล พ.ศ. 2562 ในส่วนที่เกี่ยวข้องกับการให้บริการ</w:t>
+      </w:r>
+    </w:p>
+    <w:p>
+      <w:pPr>
+        <w:pStyle w:val="BodyText"/>
+      </w:pPr>
+      <w:r>
+        <w:t xml:space="preserve">14.2 ข้อมูลที่ศูนย์ฯ จัดเก็บหรือประมวลผลผ่านระบบที่จัดหา ถือเป็นกรรมสิทธิ์ของศูนย์ฯ ผู้ขายต้องไม่นำไปใช้ เปิดเผย หรือโอนให้บุคคลอื่นโดยไม่ได้รับอนุญาต</w:t>
+      </w:r>
+    </w:p>
+    <w:p>
+      <w:pPr>
+        <w:pStyle w:val="BodyText"/>
+      </w:pPr>
+      <w:r>
+        <w:t xml:space="preserve">14.3 บัญชีผู้ดูแลระบบ (Admin) ของทุกบริการต้องลงทะเบียนในนามของหน่วยงาน และส่งมอบสิทธิ์ให้ศูนย์ฯ เมื่อสิ้นสุดสัญญา</w:t>
+      </w:r>
+    </w:p>
+    <w:bookmarkEnd w:id="36"/>
+    <w:bookmarkStart w:id="37" w:name="หนวยงานผรบผดชอบ"/>
+    <w:p>
+      <w:pPr>
+        <w:pStyle w:val="Heading2"/>
+      </w:pPr>
+      <w:r>
+        <w:t xml:space="preserve">15. หน่วยงานผู้รับผิดชอบ</w:t>
+      </w:r>
+    </w:p>
+    <w:p>
+      <w:pPr>
+        <w:pStyle w:val="FirstParagraph"/>
+      </w:pPr>
+      <w:r>
+        <w:t xml:space="preserve">ศูนย์แพทยศาสตรศึกษา …………………………………. โทรศัพท์ ……………. อีเมล ……………………</w:t>
+      </w:r>
+    </w:p>
+    <w:p>
+      <w:pPr>
+        <w:pStyle w:val="BodyText"/>
+      </w:pPr>
+      <w:r>
+        <w:t xml:space="preserve">คณะกรรมการจัดทำขอบเขตของงานหรือรายละเอียดคุณลักษณะเฉพาะ</w:t>
+      </w:r>
+    </w:p>
+    <w:tbl>
+      <w:tblPr>
+        <w:tblStyle w:val="Table"/>
+        <w:tblW w:type="auto" w:w="0"/>
+        <w:tblLook w:firstRow="1" w:lastRow="0" w:firstColumn="0" w:lastColumn="0" w:noHBand="0" w:noVBand="0" w:val="0020"/>
+        <w:jc w:val="start"/>
+        <w:tblBorders>
+          <w:top w:val="single" w:sz="4" w:color="000000"/>
+          <w:left w:val="single" w:sz="4" w:color="000000"/>
+          <w:bottom w:val="single" w:sz="4" w:color="000000"/>
+          <w:right w:val="single" w:sz="4" w:color="000000"/>
+          <w:insideH w:val="single" w:sz="4" w:color="000000"/>
+          <w:insideV w:val="single" w:sz="4" w:color="000000"/>
+        </w:tblBorders>
+      </w:tblPr>
+      <w:tblGrid>
+        <w:gridCol w:w="1584"/>
+        <w:gridCol w:w="1584"/>
+        <w:gridCol w:w="1584"/>
+        <w:gridCol w:w="1584"/>
+        <w:gridCol w:w="1584"/>
+      </w:tblGrid>
+      <w:tr>
+        <w:trPr>
+          <w:tblHeader w:val="true"/>
+        </w:trPr>
+        <w:tc>
+          <w:tcPr/>
+          <w:p>
+            <w:pPr>
+              <w:pStyle w:val="Compact"/>
+              <w:jc w:val="center"/>
+            </w:pPr>
+            <w:r>
+              <w:t xml:space="preserve">ลำดับ</w:t>
+            </w:r>
+          </w:p>
+        </w:tc>
+        <w:tc>
+          <w:tcPr/>
+          <w:p>
+            <w:pPr>
+              <w:pStyle w:val="Compact"/>
+              <w:jc w:val="left"/>
+            </w:pPr>
+            <w:r>
+              <w:t xml:space="preserve">ชื่อ-สกุล</w:t>
+            </w:r>
+          </w:p>
+        </w:tc>
+        <w:tc>
+          <w:tcPr/>
+          <w:p>
+            <w:pPr>
+              <w:pStyle w:val="Compact"/>
+              <w:jc w:val="left"/>
+            </w:pPr>
+            <w:r>
+              <w:t xml:space="preserve">ตำแหน่ง</w:t>
+            </w:r>
+          </w:p>
+        </w:tc>
+        <w:tc>
+          <w:tcPr/>
+          <w:p>
+            <w:pPr>
+              <w:pStyle w:val="Compact"/>
+              <w:jc w:val="left"/>
+            </w:pPr>
+            <w:r>
+              <w:t xml:space="preserve">ตำแหน่งในคณะกรรมการ</w:t>
+            </w:r>
+          </w:p>
+        </w:tc>
+        <w:tc>
+          <w:tcPr/>
+          <w:p>
+            <w:pPr>
+              <w:pStyle w:val="Compact"/>
+              <w:jc w:val="left"/>
+            </w:pPr>
+            <w:r>
+              <w:t xml:space="preserve">ลายมือชื่อ</w:t>
+            </w:r>
+          </w:p>
+        </w:tc>
+      </w:tr>
+      <w:tr>
+        <w:tc>
+          <w:tcPr/>
+          <w:p>
+            <w:pPr>
+              <w:pStyle w:val="Compact"/>
+              <w:jc w:val="center"/>
+            </w:pPr>
+            <w:r>
+              <w:t xml:space="preserve">1</w:t>
+            </w:r>
+          </w:p>
+        </w:tc>
+        <w:tc>
+          <w:tcPr/>
+          <w:p>
+            <w:pPr>
+              <w:pStyle w:val="Compact"/>
+            </w:pPr>
+          </w:p>
+        </w:tc>
+        <w:tc>
+          <w:tcPr/>
+          <w:p>
+            <w:pPr>
+              <w:pStyle w:val="Compact"/>
+            </w:pPr>
+          </w:p>
+        </w:tc>
+        <w:tc>
+          <w:tcPr/>
+          <w:p>
+            <w:pPr>
+              <w:pStyle w:val="Compact"/>
+              <w:jc w:val="left"/>
+            </w:pPr>
+            <w:r>
+              <w:t xml:space="preserve">ประธานกรรมการ</w:t>
+            </w:r>
+          </w:p>
+        </w:tc>
+        <w:tc>
+          <w:tcPr/>
+          <w:p>
+            <w:pPr>
+              <w:pStyle w:val="Compact"/>
+            </w:pPr>
+          </w:p>
+        </w:tc>
+      </w:tr>
+      <w:tr>
+        <w:tc>
+          <w:tcPr/>
+          <w:p>
+            <w:pPr>
+              <w:pStyle w:val="Compact"/>
+              <w:jc w:val="center"/>
+            </w:pPr>
+            <w:r>
+              <w:t xml:space="preserve">2</w:t>
+            </w:r>
+          </w:p>
+        </w:tc>
+        <w:tc>
+          <w:tcPr/>
+          <w:p>
+            <w:pPr>
+              <w:pStyle w:val="Compact"/>
+            </w:pPr>
+          </w:p>
+        </w:tc>
+        <w:tc>
+          <w:tcPr/>
+          <w:p>
+            <w:pPr>
+              <w:pStyle w:val="Compact"/>
+            </w:pPr>
+          </w:p>
+        </w:tc>
+        <w:tc>
+          <w:tcPr/>
+          <w:p>
+            <w:pPr>
+              <w:pStyle w:val="Compact"/>
+              <w:jc w:val="left"/>
+            </w:pPr>
+            <w:r>
+              <w:t xml:space="preserve">กรรมการ</w:t>
+            </w:r>
+          </w:p>
+        </w:tc>
+        <w:tc>
+          <w:tcPr/>
+          <w:p>
+            <w:pPr>
+              <w:pStyle w:val="Compact"/>
+            </w:pPr>
+          </w:p>
+        </w:tc>
+      </w:tr>
+      <w:tr>
+        <w:tc>
+          <w:tcPr/>
+          <w:p>
+            <w:pPr>
+              <w:pStyle w:val="Compact"/>
+              <w:jc w:val="center"/>
+            </w:pPr>
+            <w:r>
+              <w:t xml:space="preserve">3</w:t>
+            </w:r>
+          </w:p>
+        </w:tc>
+        <w:tc>
+          <w:tcPr/>
+          <w:p>
+            <w:pPr>
+              <w:pStyle w:val="Compact"/>
+            </w:pPr>
+          </w:p>
+        </w:tc>
+        <w:tc>
+          <w:tcPr/>
+          <w:p>
+            <w:pPr>
+              <w:pStyle w:val="Compact"/>
+            </w:pPr>
+          </w:p>
+        </w:tc>
+        <w:tc>
+          <w:tcPr/>
+          <w:p>
+            <w:pPr>
+              <w:pStyle w:val="Compact"/>
+              <w:jc w:val="left"/>
+            </w:pPr>
+            <w:r>
+              <w:t xml:space="preserve">กรรมการ</w:t>
+            </w:r>
+          </w:p>
+        </w:tc>
+        <w:tc>
+          <w:tcPr/>
+          <w:p>
+            <w:pPr>
+              <w:pStyle w:val="Compact"/>
+            </w:pPr>
+          </w:p>
+        </w:tc>
+      </w:tr>
+    </w:tbl>
+    <w:p>
+      <w:r>
+        <w:br w:type="page"/>
+      </w:r>
+    </w:p>
+    <w:bookmarkEnd w:id="37"/>
+    <w:bookmarkStart w:id="44" w:name="ภาคผนวก-ก.-รายละเอยดคณลกษณะเฉพาะ"/>
     <w:p>
       <w:pPr>
         <w:pStyle w:val="Heading1"/>
       </w:pPr>
       <w:r>
-        <w:t xml:space="preserve">ร่างคุณลักษณะเฉพาะ งานเทคโนโลยีสารสนเทศ ศูนย์แพทยศาสตรศึกษา ปีงบประมาณ 2570</w:t>
-      </w:r>
-    </w:p>
-    <w:p>
-      <w:pPr>
-        <w:pStyle w:val="FirstParagraph"/>
-      </w:pPr>
-      <w:r>
-        <w:t xml:space="preserve">(ปีงบประมาณ 70 คือ พ.ศ. 2570: ตุลาคม 2569 – กันยายน 2570)</w:t>
-      </w:r>
-    </w:p>
-    <w:bookmarkStart w:id="22" w:name="X245e579d33bf84b712c09b3371c127a660c44ee"/>
+        <w:t xml:space="preserve">ภาคผนวก ก. รายละเอียดคุณลักษณะเฉพาะ</w:t>
+      </w:r>
+    </w:p>
+    <w:bookmarkStart w:id="40" w:name="รายการท-1-ระบบปญญาประดษฐ-ai-จำนวน-2-ระบบ"/>
     <w:p>
       <w:pPr>
         <w:pStyle w:val="Heading2"/>
       </w:pPr>
       <w:r>
-        <w:t xml:space="preserve">1. ระบบปัญญาประดิษฐ์ (AI) จำนวน 2 ระบบ (จัดซื้อแยก 1 ระบบ และรวมอยู่ในข้อ 2 อีก 1 ระบบ)</w:t>
+        <w:t xml:space="preserve">รายการที่ 1 ระบบปัญญาประดิษฐ์ (AI) จำนวน 2 ระบบ</w:t>
       </w:r>
     </w:p>
     <w:p>
@@ -51,14 +1916,14 @@
         <w:pStyle w:val="BodyText"/>
       </w:pPr>
       <w:r>
-        <w:t xml:space="preserve">ระบบ AI ตามข้อ 1 ประกอบด้วย 2 ระบบ ดังนี้</w:t>
-      </w:r>
-    </w:p>
-    <w:p>
-      <w:pPr>
-        <w:numPr>
-          <w:ilvl w:val="0"/>
-          <w:numId w:val="1001"/>
+        <w:t xml:space="preserve">ระบบ AI ตามรายการที่ 1 ประกอบด้วย 2 ระบบ ดังนี้</w:t>
+      </w:r>
+    </w:p>
+    <w:p>
+      <w:pPr>
+        <w:numPr>
+          <w:ilvl w:val="0"/>
+          <w:numId w:val="1003"/>
         </w:numPr>
         <w:pStyle w:val="Compact"/>
       </w:pPr>
@@ -73,14 +1938,14 @@
         <w:t xml:space="preserve"> </w:t>
       </w:r>
       <w:r>
-        <w:t xml:space="preserve">ให้บริการรวมอยู่ในแผน Google Workspace ตามข้อ 2 ไม่คิดค่าบริการแยก</w:t>
-      </w:r>
-    </w:p>
-    <w:p>
-      <w:pPr>
-        <w:numPr>
-          <w:ilvl w:val="0"/>
-          <w:numId w:val="1001"/>
+        <w:t xml:space="preserve">ให้บริการรวมอยู่ในแผน Google Workspace ตามรายการที่ 2 ไม่คิดค่าบริการแยก</w:t>
+      </w:r>
+    </w:p>
+    <w:p>
+      <w:pPr>
+        <w:numPr>
+          <w:ilvl w:val="0"/>
+          <w:numId w:val="1003"/>
         </w:numPr>
         <w:pStyle w:val="Compact"/>
       </w:pPr>
@@ -98,13 +1963,13 @@
         <w:t xml:space="preserve">จัดซื้อเป็นลิขสิทธิ์แยกตามข้อ 1.2</w:t>
       </w:r>
     </w:p>
-    <w:bookmarkStart w:id="20" w:name="Xdc86d96f828883e996ad04400694bd35814b346"/>
+    <w:bookmarkStart w:id="38" w:name="Xed177ffe4206c2225d62602e4c2b815c33cb387"/>
     <w:p>
       <w:pPr>
         <w:pStyle w:val="Heading3"/>
       </w:pPr>
       <w:r>
-        <w:t xml:space="preserve">1.1 ระบบ AI ผู้ช่วยด้านข้อมูลวิชาการ (จำนวน 1 ระบบ) — รวมอยู่ในบริการ Google Workspace ตามข้อ 2</w:t>
+        <w:t xml:space="preserve">1.1 ระบบ AI ผู้ช่วยด้านข้อมูลวิชาการ (จำนวน 1 ระบบ) รวมอยู่ในบริการ Google Workspace ตามรายการที่ 2</w:t>
       </w:r>
     </w:p>
     <w:p>
@@ -119,7 +1984,7 @@
       <w:pPr>
         <w:numPr>
           <w:ilvl w:val="0"/>
-          <w:numId w:val="1002"/>
+          <w:numId w:val="1004"/>
         </w:numPr>
         <w:pStyle w:val="Compact"/>
       </w:pPr>
@@ -131,7 +1996,7 @@
       <w:pPr>
         <w:numPr>
           <w:ilvl w:val="0"/>
-          <w:numId w:val="1002"/>
+          <w:numId w:val="1004"/>
         </w:numPr>
         <w:pStyle w:val="Compact"/>
       </w:pPr>
@@ -143,7 +2008,7 @@
       <w:pPr>
         <w:numPr>
           <w:ilvl w:val="0"/>
-          <w:numId w:val="1002"/>
+          <w:numId w:val="1004"/>
         </w:numPr>
         <w:pStyle w:val="Compact"/>
       </w:pPr>
@@ -155,7 +2020,7 @@
       <w:pPr>
         <w:numPr>
           <w:ilvl w:val="0"/>
-          <w:numId w:val="1002"/>
+          <w:numId w:val="1004"/>
         </w:numPr>
         <w:pStyle w:val="Compact"/>
       </w:pPr>
@@ -167,7 +2032,7 @@
       <w:pPr>
         <w:numPr>
           <w:ilvl w:val="0"/>
-          <w:numId w:val="1002"/>
+          <w:numId w:val="1004"/>
         </w:numPr>
         <w:pStyle w:val="Compact"/>
       </w:pPr>
@@ -179,7 +2044,7 @@
       <w:pPr>
         <w:numPr>
           <w:ilvl w:val="0"/>
-          <w:numId w:val="1002"/>
+          <w:numId w:val="1004"/>
         </w:numPr>
         <w:pStyle w:val="Compact"/>
       </w:pPr>
@@ -191,7 +2056,7 @@
       <w:pPr>
         <w:numPr>
           <w:ilvl w:val="0"/>
-          <w:numId w:val="1002"/>
+          <w:numId w:val="1004"/>
         </w:numPr>
         <w:pStyle w:val="Compact"/>
       </w:pPr>
@@ -203,7 +2068,7 @@
       <w:pPr>
         <w:numPr>
           <w:ilvl w:val="0"/>
-          <w:numId w:val="1002"/>
+          <w:numId w:val="1004"/>
         </w:numPr>
         <w:pStyle w:val="Compact"/>
       </w:pPr>
@@ -215,16 +2080,16 @@
       <w:pPr>
         <w:numPr>
           <w:ilvl w:val="0"/>
-          <w:numId w:val="1002"/>
-        </w:numPr>
-        <w:pStyle w:val="Compact"/>
-      </w:pPr>
-      <w:r>
-        <w:t xml:space="preserve">ให้บริการเป็นส่วนหนึ่งของแผน Google Workspace ในข้อ 2 โดยไม่คิดค่าใช้จ่ายเพิ่มเติม ใช้งานได้ 1 สิทธิการใช้งาน สำหรับเจ้าหน้าที่งานเทคโนโลยีสารสนเทศ (IT) ของศูนย์ฯ โดยเฉพาะ เป็นระยะเวลา 12 เดือน</w:t>
-      </w:r>
-    </w:p>
-    <w:bookmarkEnd w:id="20"/>
-    <w:bookmarkStart w:id="21" w:name="X8f0b1edbaa9227b15354edeca1002831210a07a"/>
+          <w:numId w:val="1004"/>
+        </w:numPr>
+        <w:pStyle w:val="Compact"/>
+      </w:pPr>
+      <w:r>
+        <w:t xml:space="preserve">ให้บริการเป็นส่วนหนึ่งของแผน Google Workspace ในรายการที่ 2 โดยไม่คิดค่าใช้จ่ายเพิ่มเติม ใช้งานได้ 1 สิทธิการใช้งาน สำหรับเจ้าหน้าที่งานเทคโนโลยีสารสนเทศ (IT) ของศูนย์ฯ โดยเฉพาะ เป็นระยะเวลา 12 เดือน</w:t>
+      </w:r>
+    </w:p>
+    <w:bookmarkEnd w:id="38"/>
+    <w:bookmarkStart w:id="39" w:name="X8f0b1edbaa9227b15354edeca1002831210a07a"/>
     <w:p>
       <w:pPr>
         <w:pStyle w:val="Heading3"/>
@@ -245,7 +2110,7 @@
       <w:pPr>
         <w:numPr>
           <w:ilvl w:val="0"/>
-          <w:numId w:val="1003"/>
+          <w:numId w:val="1005"/>
         </w:numPr>
         <w:pStyle w:val="Compact"/>
       </w:pPr>
@@ -257,7 +2122,7 @@
       <w:pPr>
         <w:numPr>
           <w:ilvl w:val="0"/>
-          <w:numId w:val="1003"/>
+          <w:numId w:val="1005"/>
         </w:numPr>
         <w:pStyle w:val="Compact"/>
       </w:pPr>
@@ -269,7 +2134,7 @@
       <w:pPr>
         <w:numPr>
           <w:ilvl w:val="0"/>
-          <w:numId w:val="1003"/>
+          <w:numId w:val="1005"/>
         </w:numPr>
         <w:pStyle w:val="Compact"/>
       </w:pPr>
@@ -281,7 +2146,7 @@
       <w:pPr>
         <w:numPr>
           <w:ilvl w:val="0"/>
-          <w:numId w:val="1003"/>
+          <w:numId w:val="1005"/>
         </w:numPr>
         <w:pStyle w:val="Compact"/>
       </w:pPr>
@@ -293,7 +2158,7 @@
       <w:pPr>
         <w:numPr>
           <w:ilvl w:val="0"/>
-          <w:numId w:val="1003"/>
+          <w:numId w:val="1005"/>
         </w:numPr>
         <w:pStyle w:val="Compact"/>
       </w:pPr>
@@ -305,7 +2170,7 @@
       <w:pPr>
         <w:numPr>
           <w:ilvl w:val="0"/>
-          <w:numId w:val="1003"/>
+          <w:numId w:val="1005"/>
         </w:numPr>
         <w:pStyle w:val="Compact"/>
       </w:pPr>
@@ -317,7 +2182,7 @@
       <w:pPr>
         <w:numPr>
           <w:ilvl w:val="0"/>
-          <w:numId w:val="1003"/>
+          <w:numId w:val="1005"/>
         </w:numPr>
         <w:pStyle w:val="Compact"/>
       </w:pPr>
@@ -329,7 +2194,19 @@
       <w:pPr>
         <w:numPr>
           <w:ilvl w:val="0"/>
-          <w:numId w:val="1003"/>
+          <w:numId w:val="1005"/>
+        </w:numPr>
+        <w:pStyle w:val="Compact"/>
+      </w:pPr>
+      <w:r>
+        <w:t xml:space="preserve">มีการเลือกปิดการนำข้อมูลของผู้ใช้ไปฝึกสอนโมเดล</w:t>
+      </w:r>
+    </w:p>
+    <w:p>
+      <w:pPr>
+        <w:numPr>
+          <w:ilvl w:val="0"/>
+          <w:numId w:val="1005"/>
         </w:numPr>
         <w:pStyle w:val="Compact"/>
       </w:pPr>
@@ -337,15 +2214,15 @@
         <w:t xml:space="preserve">ใช้งานได้ 1 สิทธิการใช้งาน สำหรับเจ้าหน้าที่งานเทคโนโลยีสารสนเทศ (IT) ของศูนย์ฯ โดยเฉพาะ เป็นระยะเวลา 12 เดือน</w:t>
       </w:r>
     </w:p>
-    <w:bookmarkEnd w:id="21"/>
-    <w:bookmarkEnd w:id="22"/>
-    <w:bookmarkStart w:id="23" w:name="Xfe21c5e427262c9feaa8d7de5f10396f14fc58c"/>
+    <w:bookmarkEnd w:id="39"/>
+    <w:bookmarkEnd w:id="40"/>
+    <w:bookmarkStart w:id="41" w:name="X03d05c867e0810bd2944bb3f5ba1b99a0284a8a"/>
     <w:p>
       <w:pPr>
         <w:pStyle w:val="Heading2"/>
       </w:pPr>
       <w:r>
-        <w:t xml:space="preserve">2. ระบบอีเมลและพื้นที่จัดเก็บข้อมูลบนคลาวด์ (Google Workspace จำนวน 1 ผู้ใช้)</w:t>
+        <w:t xml:space="preserve">รายการที่ 2 ระบบอีเมลและพื้นที่จัดเก็บข้อมูลบนคลาวด์ (Google Workspace จำนวน 1 ผู้ใช้)</w:t>
       </w:r>
     </w:p>
     <w:p>
@@ -363,7 +2240,7 @@
         <w:t xml:space="preserve"> </w:t>
       </w:r>
       <w:r>
-        <w:t xml:space="preserve">หน่วยงานใช้งาน Google Apps Script และ Google Sheets ในการพัฒนาระบบงานอยู่แล้ว (เช่น ระบบจองห้องเรียน ระบบเบิกยืมอุปกรณ์) จึงจำเป็นต้องใช้บริการของ Google Workspace เพื่อให้ทำงานร่วมกับระบบเดิมได้โดยไม่ต้องย้ายหรือพัฒนาใหม่</w:t>
+        <w:t xml:space="preserve">ตามข้อ 4.3 ของขอบเขตของงาน</w:t>
       </w:r>
     </w:p>
     <w:p>
@@ -378,19 +2255,19 @@
       <w:pPr>
         <w:numPr>
           <w:ilvl w:val="0"/>
-          <w:numId w:val="1004"/>
-        </w:numPr>
-        <w:pStyle w:val="Compact"/>
-      </w:pPr>
-      <w:r>
-        <w:t xml:space="preserve">เป็นบริการ Google Workspace (Gmail และ Google Drive) ที่ใช้ชื่อโดเมนของศูนย์ฯ ได้ (เช่น ชื่อ@โดเมนของศูนย์ฯ) และต้องผูกกับโดเมนในข้อ 3</w:t>
-      </w:r>
-    </w:p>
-    <w:p>
-      <w:pPr>
-        <w:numPr>
-          <w:ilvl w:val="0"/>
-          <w:numId w:val="1004"/>
+          <w:numId w:val="1006"/>
+        </w:numPr>
+        <w:pStyle w:val="Compact"/>
+      </w:pPr>
+      <w:r>
+        <w:t xml:space="preserve">เป็นบริการ Google Workspace (Gmail และ Google Drive) ที่ใช้ชื่อโดเมนของศูนย์ฯ ได้ (เช่น ชื่อ@โดเมนของศูนย์ฯ) และต้องผูกกับโดเมนในรายการที่ 3</w:t>
+      </w:r>
+    </w:p>
+    <w:p>
+      <w:pPr>
+        <w:numPr>
+          <w:ilvl w:val="0"/>
+          <w:numId w:val="1006"/>
         </w:numPr>
         <w:pStyle w:val="Compact"/>
       </w:pPr>
@@ -402,31 +2279,31 @@
       <w:pPr>
         <w:numPr>
           <w:ilvl w:val="0"/>
-          <w:numId w:val="1004"/>
-        </w:numPr>
-        <w:pStyle w:val="Compact"/>
-      </w:pPr>
-      <w:r>
-        <w:t xml:space="preserve">แผนบริการที่เสนอต้องมีผู้ช่วย AI ระบบ Generative AI (Gemini) รวมอยู่ในแผนโดยไม่มีค่าใช้จ่ายเพิ่ม และต้องมีคุณสมบัติตามข้อ 1.1 (ข้อ 1–8) ครบถ้วน ใช้งานกับ Gmail, Docs, Sheets, Drive และใช้งานผ่านเว็บเบราว์เซอร์ได้</w:t>
-      </w:r>
-    </w:p>
-    <w:p>
-      <w:pPr>
-        <w:numPr>
-          <w:ilvl w:val="0"/>
-          <w:numId w:val="1004"/>
-        </w:numPr>
-        <w:pStyle w:val="Compact"/>
-      </w:pPr>
-      <w:r>
-        <w:t xml:space="preserve">มีพื้นที่จัดเก็บข้อมูลบนคลาวด์ (Drive) ไม่น้อยกว่า 1 TB ต่อผู้ใช้ (ควรกำหนดตามปริมาณข้อมูลจริง)</w:t>
-      </w:r>
-    </w:p>
-    <w:p>
-      <w:pPr>
-        <w:numPr>
-          <w:ilvl w:val="0"/>
-          <w:numId w:val="1004"/>
+          <w:numId w:val="1006"/>
+        </w:numPr>
+        <w:pStyle w:val="Compact"/>
+      </w:pPr>
+      <w:r>
+        <w:t xml:space="preserve">แผนบริการที่เสนอต้องมีผู้ช่วย AI ระบบ Generative AI (Gemini) รวมอยู่ในแผนโดยไม่มีค่าใช้จ่ายเพิ่ม และต้องมีคุณสมบัติตามรายการที่ 1.1 (ข้อ 1–8) ครบถ้วน ใช้งานกับ Gmail, Docs, Sheets, Drive และใช้งานผ่านเว็บเบราว์เซอร์ได้</w:t>
+      </w:r>
+    </w:p>
+    <w:p>
+      <w:pPr>
+        <w:numPr>
+          <w:ilvl w:val="0"/>
+          <w:numId w:val="1006"/>
+        </w:numPr>
+        <w:pStyle w:val="Compact"/>
+      </w:pPr>
+      <w:r>
+        <w:t xml:space="preserve">มีพื้นที่จัดเก็บข้อมูลบนคลาวด์ (Drive) ไม่น้อยกว่า …….. TB ต่อผู้ใช้</w:t>
+      </w:r>
+    </w:p>
+    <w:p>
+      <w:pPr>
+        <w:numPr>
+          <w:ilvl w:val="0"/>
+          <w:numId w:val="1006"/>
         </w:numPr>
         <w:pStyle w:val="Compact"/>
       </w:pPr>
@@ -438,7 +2315,7 @@
       <w:pPr>
         <w:numPr>
           <w:ilvl w:val="0"/>
-          <w:numId w:val="1004"/>
+          <w:numId w:val="1006"/>
         </w:numPr>
         <w:pStyle w:val="Compact"/>
       </w:pPr>
@@ -450,7 +2327,7 @@
       <w:pPr>
         <w:numPr>
           <w:ilvl w:val="0"/>
-          <w:numId w:val="1004"/>
+          <w:numId w:val="1006"/>
         </w:numPr>
         <w:pStyle w:val="Compact"/>
       </w:pPr>
@@ -462,7 +2339,7 @@
       <w:pPr>
         <w:numPr>
           <w:ilvl w:val="0"/>
-          <w:numId w:val="1004"/>
+          <w:numId w:val="1006"/>
         </w:numPr>
         <w:pStyle w:val="Compact"/>
       </w:pPr>
@@ -474,7 +2351,7 @@
       <w:pPr>
         <w:numPr>
           <w:ilvl w:val="0"/>
-          <w:numId w:val="1004"/>
+          <w:numId w:val="1006"/>
         </w:numPr>
         <w:pStyle w:val="Compact"/>
       </w:pPr>
@@ -486,7 +2363,7 @@
       <w:pPr>
         <w:numPr>
           <w:ilvl w:val="0"/>
-          <w:numId w:val="1004"/>
+          <w:numId w:val="1006"/>
         </w:numPr>
         <w:pStyle w:val="Compact"/>
       </w:pPr>
@@ -498,7 +2375,7 @@
       <w:pPr>
         <w:numPr>
           <w:ilvl w:val="0"/>
-          <w:numId w:val="1004"/>
+          <w:numId w:val="1006"/>
         </w:numPr>
         <w:pStyle w:val="Compact"/>
       </w:pPr>
@@ -506,33 +2383,33 @@
         <w:t xml:space="preserve">ระยะเวลาใช้งาน 12 เดือน</w:t>
       </w:r>
     </w:p>
-    <w:bookmarkEnd w:id="23"/>
-    <w:bookmarkStart w:id="24" w:name="X38d9e7776466e59ea9048ce72f1a560c2eb45c1"/>
+    <w:bookmarkEnd w:id="41"/>
+    <w:bookmarkStart w:id="42" w:name="Xc5b864ca36f01936458f3059df877a3d0abc653"/>
     <w:p>
       <w:pPr>
         <w:pStyle w:val="Heading2"/>
       </w:pPr>
       <w:r>
-        <w:t xml:space="preserve">3. การจดทะเบียนชื่อโดเมน (Domain Name) สำหรับเว็บไซต์ศูนย์แพทยศาสตรศึกษา</w:t>
-      </w:r>
-    </w:p>
-    <w:p>
-      <w:pPr>
-        <w:numPr>
-          <w:ilvl w:val="0"/>
-          <w:numId w:val="1005"/>
-        </w:numPr>
-        <w:pStyle w:val="Compact"/>
-      </w:pPr>
-      <w:r>
-        <w:t xml:space="preserve">จดทะเบียนชื่อโดเมนที่สื่อถึงศูนย์แพทยศาสตรศึกษา จำนวน 1 ชื่อ ระยะเวลาอย่างน้อย 1 ปี (พิจารณาจดหลายปีเพื่อลดภาระการต่ออายุ)</w:t>
-      </w:r>
-    </w:p>
-    <w:p>
-      <w:pPr>
-        <w:numPr>
-          <w:ilvl w:val="0"/>
-          <w:numId w:val="1005"/>
+        <w:t xml:space="preserve">รายการที่ 3 การจดทะเบียนชื่อโดเมน (Domain Name) สำหรับเว็บไซต์ศูนย์แพทยศาสตรศึกษา</w:t>
+      </w:r>
+    </w:p>
+    <w:p>
+      <w:pPr>
+        <w:numPr>
+          <w:ilvl w:val="0"/>
+          <w:numId w:val="1007"/>
+        </w:numPr>
+        <w:pStyle w:val="Compact"/>
+      </w:pPr>
+      <w:r>
+        <w:t xml:space="preserve">จดทะเบียนชื่อโดเมนที่สื่อถึงศูนย์แพทยศาสตรศึกษา จำนวน 1 ชื่อ ระยะเวลาไม่น้อยกว่า 1 ปี (ชื่อที่ต้องการ: ………………………………….)</w:t>
+      </w:r>
+    </w:p>
+    <w:p>
+      <w:pPr>
+        <w:numPr>
+          <w:ilvl w:val="0"/>
+          <w:numId w:val="1007"/>
         </w:numPr>
         <w:pStyle w:val="Compact"/>
       </w:pPr>
@@ -544,7 +2421,7 @@
       <w:pPr>
         <w:numPr>
           <w:ilvl w:val="0"/>
-          <w:numId w:val="1005"/>
+          <w:numId w:val="1007"/>
         </w:numPr>
         <w:pStyle w:val="Compact"/>
       </w:pPr>
@@ -556,7 +2433,7 @@
       <w:pPr>
         <w:numPr>
           <w:ilvl w:val="0"/>
-          <w:numId w:val="1005"/>
+          <w:numId w:val="1007"/>
         </w:numPr>
         <w:pStyle w:val="Compact"/>
       </w:pPr>
@@ -568,19 +2445,19 @@
       <w:pPr>
         <w:numPr>
           <w:ilvl w:val="0"/>
-          <w:numId w:val="1005"/>
-        </w:numPr>
-        <w:pStyle w:val="Compact"/>
-      </w:pPr>
-      <w:r>
-        <w:t xml:space="preserve">กำหนดให้ชื่อโดเมนอยู่ในความครอบครองของหน่วยงาน โดยระบุหน่วยงานเป็นผู้ถือครอง (Registrant) ไม่ใช่ชื่อบุคคล</w:t>
-      </w:r>
-    </w:p>
-    <w:p>
-      <w:pPr>
-        <w:numPr>
-          <w:ilvl w:val="0"/>
-          <w:numId w:val="1005"/>
+          <w:numId w:val="1007"/>
+        </w:numPr>
+        <w:pStyle w:val="Compact"/>
+      </w:pPr>
+      <w:r>
+        <w:t xml:space="preserve">ระบุหน่วยงานเป็นผู้ถือครอง (Registrant) ไม่ใช่ชื่อบุคคล</w:t>
+      </w:r>
+    </w:p>
+    <w:p>
+      <w:pPr>
+        <w:numPr>
+          <w:ilvl w:val="0"/>
+          <w:numId w:val="1007"/>
         </w:numPr>
         <w:pStyle w:val="Compact"/>
       </w:pPr>
@@ -592,7 +2469,19 @@
       <w:pPr>
         <w:numPr>
           <w:ilvl w:val="0"/>
-          <w:numId w:val="1005"/>
+          <w:numId w:val="1007"/>
+        </w:numPr>
+        <w:pStyle w:val="Compact"/>
+      </w:pPr>
+      <w:r>
+        <w:t xml:space="preserve">ต้องไม่มีเงื่อนไขที่ทำให้ย้ายนายทะเบียนไม่ได้ และต้องส่งมอบรหัสโอนโดเมน (Auth Code) เมื่อศูนย์ฯ ร้องขอ</w:t>
+      </w:r>
+    </w:p>
+    <w:p>
+      <w:pPr>
+        <w:numPr>
+          <w:ilvl w:val="0"/>
+          <w:numId w:val="1007"/>
         </w:numPr>
         <w:pStyle w:val="Compact"/>
       </w:pPr>
@@ -600,14 +2489,14 @@
         <w:t xml:space="preserve">ควรรวมใบรับรอง SSL/TLS (HTTPS) ไว้ด้วย หรือสามารถออกใบรับรองฟรีได้</w:t>
       </w:r>
     </w:p>
-    <w:bookmarkEnd w:id="24"/>
-    <w:bookmarkStart w:id="25" w:name="X5602943701eddcd4151a5e9fe760085fa82d7a3"/>
+    <w:bookmarkEnd w:id="42"/>
+    <w:bookmarkStart w:id="43" w:name="X84ed54c324323152ab215f134819ab7bf508ad4"/>
     <w:p>
       <w:pPr>
         <w:pStyle w:val="Heading2"/>
       </w:pPr>
       <w:r>
-        <w:t xml:space="preserve">4. ระบบ LINE Official Account (LINE OA) และ Chatbot</w:t>
+        <w:t xml:space="preserve">รายการที่ 4 ระบบ LINE Official Account (LINE OA) และ Chatbot</w:t>
       </w:r>
     </w:p>
     <w:p>
@@ -615,6 +2504,24 @@
         <w:pStyle w:val="FirstParagraph"/>
       </w:pPr>
       <w:r>
+        <w:rPr>
+          <w:bCs/>
+          <w:b/>
+        </w:rPr>
+        <w:t xml:space="preserve">เหตุผลความจำเป็นในการระบุผลิตภัณฑ์:</w:t>
+      </w:r>
+      <w:r>
+        <w:t xml:space="preserve"> </w:t>
+      </w:r>
+      <w:r>
+        <w:t xml:space="preserve">ตามข้อ 4.3 ของขอบเขตของงาน</w:t>
+      </w:r>
+    </w:p>
+    <w:p>
+      <w:pPr>
+        <w:pStyle w:val="BodyText"/>
+      </w:pPr>
+      <w:r>
         <w:t xml:space="preserve">วัตถุประสงค์: สื่อสาร ประชาสัมพันธ์ และเชื่อมต่อกับระบบบริการของศูนย์ฯ เช่น ระบบจองห้องเรียน ระบบเบิกยืมอุปกรณ์</w:t>
       </w:r>
     </w:p>
@@ -622,19 +2529,19 @@
       <w:pPr>
         <w:numPr>
           <w:ilvl w:val="0"/>
-          <w:numId w:val="1006"/>
-        </w:numPr>
-        <w:pStyle w:val="Compact"/>
-      </w:pPr>
-      <w:r>
-        <w:t xml:space="preserve">จัดตั้งบัญชี LINE Official Account จำนวน 1 บัญชี พร้อมแผนบริการที่รองรับจำนวนข้อความต่อเดือนอย่างเพียงพอ</w:t>
-      </w:r>
-    </w:p>
-    <w:p>
-      <w:pPr>
-        <w:numPr>
-          <w:ilvl w:val="0"/>
-          <w:numId w:val="1006"/>
+          <w:numId w:val="1008"/>
+        </w:numPr>
+        <w:pStyle w:val="Compact"/>
+      </w:pPr>
+      <w:r>
+        <w:t xml:space="preserve">จัดตั้งบัญชี LINE Official Account จำนวน 1 บัญชี พร้อมแผนบริการที่รองรับจำนวนข้อความต่อเดือนไม่น้อยกว่า …….. ข้อความ</w:t>
+      </w:r>
+    </w:p>
+    <w:p>
+      <w:pPr>
+        <w:numPr>
+          <w:ilvl w:val="0"/>
+          <w:numId w:val="1008"/>
         </w:numPr>
         <w:pStyle w:val="Compact"/>
       </w:pPr>
@@ -646,7 +2553,7 @@
       <w:pPr>
         <w:numPr>
           <w:ilvl w:val="0"/>
-          <w:numId w:val="1006"/>
+          <w:numId w:val="1008"/>
         </w:numPr>
         <w:pStyle w:val="Compact"/>
       </w:pPr>
@@ -658,7 +2565,7 @@
       <w:pPr>
         <w:numPr>
           <w:ilvl w:val="0"/>
-          <w:numId w:val="1006"/>
+          <w:numId w:val="1008"/>
         </w:numPr>
         <w:pStyle w:val="Compact"/>
       </w:pPr>
@@ -670,7 +2577,7 @@
       <w:pPr>
         <w:numPr>
           <w:ilvl w:val="0"/>
-          <w:numId w:val="1006"/>
+          <w:numId w:val="1008"/>
         </w:numPr>
         <w:pStyle w:val="Compact"/>
       </w:pPr>
@@ -682,7 +2589,7 @@
       <w:pPr>
         <w:numPr>
           <w:ilvl w:val="0"/>
-          <w:numId w:val="1006"/>
+          <w:numId w:val="1008"/>
         </w:numPr>
         <w:pStyle w:val="Compact"/>
       </w:pPr>
@@ -694,7 +2601,7 @@
       <w:pPr>
         <w:numPr>
           <w:ilvl w:val="0"/>
-          <w:numId w:val="1006"/>
+          <w:numId w:val="1008"/>
         </w:numPr>
         <w:pStyle w:val="Compact"/>
       </w:pPr>
@@ -706,7 +2613,7 @@
       <w:pPr>
         <w:numPr>
           <w:ilvl w:val="0"/>
-          <w:numId w:val="1006"/>
+          <w:numId w:val="1008"/>
         </w:numPr>
         <w:pStyle w:val="Compact"/>
       </w:pPr>
@@ -718,7 +2625,7 @@
       <w:pPr>
         <w:numPr>
           <w:ilvl w:val="0"/>
-          <w:numId w:val="1006"/>
+          <w:numId w:val="1008"/>
         </w:numPr>
         <w:pStyle w:val="Compact"/>
       </w:pPr>
@@ -730,19 +2637,19 @@
       <w:pPr>
         <w:numPr>
           <w:ilvl w:val="0"/>
-          <w:numId w:val="1006"/>
-        </w:numPr>
-        <w:pStyle w:val="Compact"/>
-      </w:pPr>
-      <w:r>
-        <w:t xml:space="preserve">การพัฒนาและการเก็บข้อมูลต้องเป็นไปตามกฎหมายคุ้มครองข้อมูลส่วนบุคคล (PDPA)</w:t>
-      </w:r>
-    </w:p>
-    <w:p>
-      <w:pPr>
-        <w:numPr>
-          <w:ilvl w:val="0"/>
-          <w:numId w:val="1006"/>
+          <w:numId w:val="1008"/>
+        </w:numPr>
+        <w:pStyle w:val="Compact"/>
+      </w:pPr>
+      <w:r>
+        <w:t xml:space="preserve">การเก็บและใช้ข้อมูลต้องเป็นไปตามกฎหมายคุ้มครองข้อมูลส่วนบุคคล (PDPA)</w:t>
+      </w:r>
+    </w:p>
+    <w:p>
+      <w:pPr>
+        <w:numPr>
+          <w:ilvl w:val="0"/>
+          <w:numId w:val="1008"/>
         </w:numPr>
         <w:pStyle w:val="Compact"/>
       </w:pPr>
@@ -750,66 +2657,26 @@
         <w:t xml:space="preserve">ระยะเวลาใช้งาน 12 เดือน</w:t>
       </w:r>
     </w:p>
-    <w:bookmarkEnd w:id="25"/>
-    <w:bookmarkStart w:id="26" w:name="ขอกำหนดทวไป-ใชกบทกรายการ"/>
-    <w:p>
-      <w:pPr>
-        <w:pStyle w:val="Heading2"/>
-      </w:pPr>
-      <w:r>
-        <w:t xml:space="preserve">ข้อกำหนดทั่วไป (ใช้กับทุกรายการ)</w:t>
-      </w:r>
-    </w:p>
-    <w:p>
-      <w:pPr>
-        <w:numPr>
-          <w:ilvl w:val="0"/>
-          <w:numId w:val="1007"/>
-        </w:numPr>
-        <w:pStyle w:val="Compact"/>
-      </w:pPr>
-      <w:r>
-        <w:t xml:space="preserve">ผู้ขายต้องส่งมอบบัญชีและรหัสผ่านให้หน่วยงาน และลงทะเบียนด้วยอีเมลของหน่วยงาน</w:t>
-      </w:r>
-    </w:p>
-    <w:p>
-      <w:pPr>
-        <w:numPr>
-          <w:ilvl w:val="0"/>
-          <w:numId w:val="1007"/>
-        </w:numPr>
-        <w:pStyle w:val="Compact"/>
-      </w:pPr>
-      <w:r>
-        <w:t xml:space="preserve">ผู้ขายต้องให้คำแนะนำการติดตั้งและการใช้งานเบื้องต้น</w:t>
-      </w:r>
-    </w:p>
-    <w:p>
-      <w:pPr>
-        <w:numPr>
-          <w:ilvl w:val="0"/>
-          <w:numId w:val="1007"/>
-        </w:numPr>
-        <w:pStyle w:val="Compact"/>
-      </w:pPr>
-      <w:r>
-        <w:t xml:space="preserve">หากบริการหยุดชะงักจากฝั่งผู้ให้บริการ ต้องมีช่องทางติดต่อขอรับการสนับสนุน</w:t>
-      </w:r>
-    </w:p>
-    <w:p>
-      <w:pPr>
-        <w:numPr>
-          <w:ilvl w:val="0"/>
-          <w:numId w:val="1007"/>
-        </w:numPr>
-        <w:pStyle w:val="Compact"/>
-      </w:pPr>
-      <w:r>
-        <w:t xml:space="preserve">กำหนดส่งมอบภายใน …….. วัน นับจากวันลงนามในสัญญา</w:t>
-      </w:r>
-    </w:p>
-    <w:bookmarkEnd w:id="26"/>
-    <w:bookmarkEnd w:id="27"/>
+    <w:p>
+      <w:pPr>
+        <w:pStyle w:val="FirstParagraph"/>
+      </w:pPr>
+      <w:r>
+        <w:rPr>
+          <w:bCs/>
+          <w:b/>
+        </w:rPr>
+        <w:t xml:space="preserve">หมายเหตุ:</w:t>
+      </w:r>
+      <w:r>
+        <w:t xml:space="preserve"> </w:t>
+      </w:r>
+      <w:r>
+        <w:t xml:space="preserve">ขอบเขตรายการที่ 4 ครอบคลุมการจัดหาบัญชีและแผนบริการ และเปิดใช้ช่องทางสำหรับพัฒนา Chatbot เท่านั้น ไม่รวมงานพัฒนาซอฟต์แวร์ Chatbot ซึ่งดำเนินการโดยเจ้าหน้าที่ของศูนย์ฯ</w:t>
+      </w:r>
+    </w:p>
+    <w:bookmarkEnd w:id="43"/>
+    <w:bookmarkEnd w:id="44"/>
     <w:sectPr/>
   </w:body>
 </w:document>
@@ -1084,64 +2951,10 @@
     <w:abstractNumId w:val="991"/>
   </w:num>
   <w:num w:numId="1002">
-    <w:abstractNumId w:val="99411"/>
-    <w:lvlOverride w:ilvl="0">
-      <w:startOverride w:val="1"/>
-    </w:lvlOverride>
-    <w:lvlOverride w:ilvl="1">
-      <w:startOverride w:val="1"/>
-    </w:lvlOverride>
-    <w:lvlOverride w:ilvl="2">
-      <w:startOverride w:val="1"/>
-    </w:lvlOverride>
-    <w:lvlOverride w:ilvl="3">
-      <w:startOverride w:val="1"/>
-    </w:lvlOverride>
-    <w:lvlOverride w:ilvl="4">
-      <w:startOverride w:val="1"/>
-    </w:lvlOverride>
-    <w:lvlOverride w:ilvl="5">
-      <w:startOverride w:val="1"/>
-    </w:lvlOverride>
-    <w:lvlOverride w:ilvl="6">
-      <w:startOverride w:val="1"/>
-    </w:lvlOverride>
-    <w:lvlOverride w:ilvl="7">
-      <w:startOverride w:val="1"/>
-    </w:lvlOverride>
-    <w:lvlOverride w:ilvl="8">
-      <w:startOverride w:val="1"/>
-    </w:lvlOverride>
+    <w:abstractNumId w:val="991"/>
   </w:num>
   <w:num w:numId="1003">
-    <w:abstractNumId w:val="99411"/>
-    <w:lvlOverride w:ilvl="0">
-      <w:startOverride w:val="1"/>
-    </w:lvlOverride>
-    <w:lvlOverride w:ilvl="1">
-      <w:startOverride w:val="1"/>
-    </w:lvlOverride>
-    <w:lvlOverride w:ilvl="2">
-      <w:startOverride w:val="1"/>
-    </w:lvlOverride>
-    <w:lvlOverride w:ilvl="3">
-      <w:startOverride w:val="1"/>
-    </w:lvlOverride>
-    <w:lvlOverride w:ilvl="4">
-      <w:startOverride w:val="1"/>
-    </w:lvlOverride>
-    <w:lvlOverride w:ilvl="5">
-      <w:startOverride w:val="1"/>
-    </w:lvlOverride>
-    <w:lvlOverride w:ilvl="6">
-      <w:startOverride w:val="1"/>
-    </w:lvlOverride>
-    <w:lvlOverride w:ilvl="7">
-      <w:startOverride w:val="1"/>
-    </w:lvlOverride>
-    <w:lvlOverride w:ilvl="8">
-      <w:startOverride w:val="1"/>
-    </w:lvlOverride>
+    <w:abstractNumId w:val="991"/>
   </w:num>
   <w:num w:numId="1004">
     <w:abstractNumId w:val="99411"/>
@@ -1234,7 +3047,64 @@
     </w:lvlOverride>
   </w:num>
   <w:num w:numId="1007">
-    <w:abstractNumId w:val="991"/>
+    <w:abstractNumId w:val="99411"/>
+    <w:lvlOverride w:ilvl="0">
+      <w:startOverride w:val="1"/>
+    </w:lvlOverride>
+    <w:lvlOverride w:ilvl="1">
+      <w:startOverride w:val="1"/>
+    </w:lvlOverride>
+    <w:lvlOverride w:ilvl="2">
+      <w:startOverride w:val="1"/>
+    </w:lvlOverride>
+    <w:lvlOverride w:ilvl="3">
+      <w:startOverride w:val="1"/>
+    </w:lvlOverride>
+    <w:lvlOverride w:ilvl="4">
+      <w:startOverride w:val="1"/>
+    </w:lvlOverride>
+    <w:lvlOverride w:ilvl="5">
+      <w:startOverride w:val="1"/>
+    </w:lvlOverride>
+    <w:lvlOverride w:ilvl="6">
+      <w:startOverride w:val="1"/>
+    </w:lvlOverride>
+    <w:lvlOverride w:ilvl="7">
+      <w:startOverride w:val="1"/>
+    </w:lvlOverride>
+    <w:lvlOverride w:ilvl="8">
+      <w:startOverride w:val="1"/>
+    </w:lvlOverride>
+  </w:num>
+  <w:num w:numId="1008">
+    <w:abstractNumId w:val="99411"/>
+    <w:lvlOverride w:ilvl="0">
+      <w:startOverride w:val="1"/>
+    </w:lvlOverride>
+    <w:lvlOverride w:ilvl="1">
+      <w:startOverride w:val="1"/>
+    </w:lvlOverride>
+    <w:lvlOverride w:ilvl="2">
+      <w:startOverride w:val="1"/>
+    </w:lvlOverride>
+    <w:lvlOverride w:ilvl="3">
+      <w:startOverride w:val="1"/>
+    </w:lvlOverride>
+    <w:lvlOverride w:ilvl="4">
+      <w:startOverride w:val="1"/>
+    </w:lvlOverride>
+    <w:lvlOverride w:ilvl="5">
+      <w:startOverride w:val="1"/>
+    </w:lvlOverride>
+    <w:lvlOverride w:ilvl="6">
+      <w:startOverride w:val="1"/>
+    </w:lvlOverride>
+    <w:lvlOverride w:ilvl="7">
+      <w:startOverride w:val="1"/>
+    </w:lvlOverride>
+    <w:lvlOverride w:ilvl="8">
+      <w:startOverride w:val="1"/>
+    </w:lvlOverride>
   </w:num>
 </w:numbering>
 </file>
@@ -1260,6 +3130,11 @@
   <w:style w:default="1" w:styleId="Normal" w:type="paragraph">
     <w:name w:val="Normal"/>
     <w:qFormat/>
+    <w:rPr>
+      <w:rFonts w:ascii="TH Sarabun New" w:cs="TH Sarabun New" w:eastAsia="TH Sarabun New" w:hAnsi="TH Sarabun New"/>
+      <w:sz w:val="32"/>
+      <w:szCs w:val="32"/>
+    </w:rPr>
   </w:style>
   <w:style w:styleId="BodyText" w:type="paragraph">
     <w:name w:val="Body Text"/>
@@ -1269,12 +3144,22 @@
       <w:spacing w:after="180" w:before="180"/>
     </w:pPr>
     <w:qFormat/>
+    <w:rPr>
+      <w:rFonts w:ascii="TH Sarabun New" w:cs="TH Sarabun New" w:eastAsia="TH Sarabun New" w:hAnsi="TH Sarabun New"/>
+      <w:sz w:val="32"/>
+      <w:szCs w:val="32"/>
+    </w:rPr>
   </w:style>
   <w:style w:customStyle="1" w:styleId="FirstParagraph" w:type="paragraph">
     <w:name w:val="First Paragraph"/>
     <w:basedOn w:val="BodyText"/>
     <w:next w:val="BodyText"/>
     <w:qFormat/>
+    <w:rPr>
+      <w:rFonts w:ascii="TH Sarabun New" w:cs="TH Sarabun New" w:eastAsia="TH Sarabun New" w:hAnsi="TH Sarabun New"/>
+      <w:sz w:val="32"/>
+      <w:szCs w:val="32"/>
+    </w:rPr>
   </w:style>
   <w:style w:customStyle="1" w:styleId="Compact" w:type="paragraph">
     <w:name w:val="Compact"/>
@@ -1283,6 +3168,11 @@
     <w:pPr>
       <w:spacing w:after="36" w:before="36"/>
     </w:pPr>
+    <w:rPr>
+      <w:rFonts w:ascii="TH Sarabun New" w:cs="TH Sarabun New" w:eastAsia="TH Sarabun New" w:hAnsi="TH Sarabun New"/>
+      <w:sz w:val="32"/>
+      <w:szCs w:val="32"/>
+    </w:rPr>
   </w:style>
   <w:style w:styleId="Title" w:type="paragraph">
     <w:name w:val="Title"/>
@@ -1296,12 +3186,11 @@
       <w:jc w:val="center"/>
     </w:pPr>
     <w:rPr>
-      <w:rFonts w:asciiTheme="majorHAnsi" w:cstheme="majorBidi" w:eastAsiaTheme="majorEastAsia" w:hAnsiTheme="majorHAnsi"/>
+      <w:rFonts w:ascii="TH Sarabun New" w:cs="TH Sarabun New" w:eastAsia="TH Sarabun New" w:hAnsi="TH Sarabun New"/>
       <w:b/>
       <w:bCs/>
-      <w:color w:themeColor="accent1" w:themeShade="B5" w:val="345A8A"/>
-      <w:sz w:val="36"/>
-      <w:szCs w:val="36"/>
+      <w:sz w:val="52"/>
+      <w:szCs w:val="52"/>
     </w:rPr>
   </w:style>
   <w:style w:styleId="Subtitle" w:type="paragraph">
@@ -1316,8 +3205,10 @@
       <w:jc w:val="center"/>
     </w:pPr>
     <w:rPr>
-      <w:sz w:val="30"/>
-      <w:szCs w:val="30"/>
+      <w:b/>
+      <w:sz w:val="40"/>
+      <w:szCs w:val="40"/>
+      <w:rFonts w:ascii="TH Sarabun New" w:cs="TH Sarabun New" w:eastAsia="TH Sarabun New" w:hAnsi="TH Sarabun New"/>
     </w:rPr>
   </w:style>
   <w:style w:customStyle="1" w:styleId="Author" w:type="paragraph">
@@ -1329,6 +3220,11 @@
       <w:keepLines/>
       <w:jc w:val="center"/>
     </w:pPr>
+    <w:rPr>
+      <w:rFonts w:ascii="TH Sarabun New" w:cs="TH Sarabun New" w:eastAsia="TH Sarabun New" w:hAnsi="TH Sarabun New"/>
+      <w:sz w:val="32"/>
+      <w:szCs w:val="32"/>
+    </w:rPr>
   </w:style>
   <w:style w:styleId="Date" w:type="paragraph">
     <w:name w:val="Date"/>
@@ -1339,6 +3235,11 @@
       <w:keepLines/>
       <w:jc w:val="center"/>
     </w:pPr>
+    <w:rPr>
+      <w:rFonts w:ascii="TH Sarabun New" w:cs="TH Sarabun New" w:eastAsia="TH Sarabun New" w:hAnsi="TH Sarabun New"/>
+      <w:sz w:val="32"/>
+      <w:szCs w:val="32"/>
+    </w:rPr>
   </w:style>
   <w:style w:customStyle="1" w:styleId="AbstractTitle" w:type="paragraph">
     <w:name w:val="Abstract Title"/>
@@ -1352,11 +3253,12 @@
       <w:spacing w:after="0" w:before="300"/>
     </w:pPr>
     <w:rPr>
-      <w:sz w:val="20"/>
-      <w:szCs w:val="20"/>
+      <w:sz w:val="32"/>
+      <w:szCs w:val="32"/>
       <w:b/>
       <w:color w:val="345A8A"/>
       &gt;
+      <w:rFonts w:ascii="TH Sarabun New" w:cs="TH Sarabun New" w:eastAsia="TH Sarabun New" w:hAnsi="TH Sarabun New"/>
     </w:rPr>
   </w:style>
   <w:style w:customStyle="1" w:styleId="Abstract" w:type="paragraph">
@@ -1370,8 +3272,9 @@
       <w:spacing w:after="300" w:before="100"/>
     </w:pPr>
     <w:rPr>
-      <w:sz w:val="20"/>
-      <w:szCs w:val="20"/>
+      <w:sz w:val="32"/>
+      <w:szCs w:val="32"/>
+      <w:rFonts w:ascii="TH Sarabun New" w:cs="TH Sarabun New" w:eastAsia="TH Sarabun New" w:hAnsi="TH Sarabun New"/>
     </w:rPr>
   </w:style>
   <w:style w:styleId="Bibliography" w:type="paragraph">
@@ -1380,7 +3283,11 @@
     <w:next w:val="Bibliography"/>
     <w:qFormat/>
     <w:pPr/>
-    <w:rPr/>
+    <w:rPr>
+      <w:rFonts w:ascii="TH Sarabun New" w:cs="TH Sarabun New" w:eastAsia="TH Sarabun New" w:hAnsi="TH Sarabun New"/>
+      <w:sz w:val="32"/>
+      <w:szCs w:val="32"/>
+    </w:rPr>
   </w:style>
   <w:style w:styleId="Heading1" w:type="paragraph">
     <w:name w:val="Heading 1"/>
@@ -1395,12 +3302,11 @@
       <w:outlineLvl w:val="0"/>
     </w:pPr>
     <w:rPr>
-      <w:rFonts w:asciiTheme="majorHAnsi" w:cstheme="majorBidi" w:eastAsiaTheme="majorEastAsia" w:hAnsiTheme="majorHAnsi"/>
+      <w:rFonts w:ascii="TH Sarabun New" w:cs="TH Sarabun New" w:eastAsia="TH Sarabun New" w:hAnsi="TH Sarabun New"/>
       <w:b/>
       <w:bCs/>
-      <w:color w:themeColor="accent1" w:val="4F81BD"/>
-      <w:sz w:val="32"/>
-      <w:szCs w:val="32"/>
+      <w:sz w:val="44"/>
+      <w:szCs w:val="44"/>
     </w:rPr>
   </w:style>
   <w:style w:styleId="Heading2" w:type="paragraph">
@@ -1417,12 +3323,11 @@
       <w:outlineLvl w:val="1"/>
     </w:pPr>
     <w:rPr>
-      <w:rFonts w:asciiTheme="majorHAnsi" w:cstheme="majorBidi" w:eastAsiaTheme="majorEastAsia" w:hAnsiTheme="majorHAnsi"/>
+      <w:rFonts w:ascii="TH Sarabun New" w:cs="TH Sarabun New" w:eastAsia="TH Sarabun New" w:hAnsi="TH Sarabun New"/>
       <w:b/>
       <w:bCs/>
-      <w:color w:themeColor="accent1" w:val="4F81BD"/>
-      <w:sz w:val="28"/>
-      <w:szCs w:val="28"/>
+      <w:sz w:val="40"/>
+      <w:szCs w:val="40"/>
     </w:rPr>
   </w:style>
   <w:style w:styleId="Heading3" w:type="paragraph">
@@ -1439,12 +3344,11 @@
       <w:outlineLvl w:val="2"/>
     </w:pPr>
     <w:rPr>
-      <w:rFonts w:asciiTheme="majorHAnsi" w:cstheme="majorBidi" w:eastAsiaTheme="majorEastAsia" w:hAnsiTheme="majorHAnsi"/>
+      <w:rFonts w:ascii="TH Sarabun New" w:cs="TH Sarabun New" w:eastAsia="TH Sarabun New" w:hAnsi="TH Sarabun New"/>
       <w:b/>
       <w:bCs/>
-      <w:color w:themeColor="accent1" w:val="4F81BD"/>
-      <w:sz w:val="24"/>
-      <w:szCs w:val="24"/>
+      <w:sz w:val="36"/>
+      <w:szCs w:val="36"/>
     </w:rPr>
   </w:style>
   <w:style w:styleId="Heading4" w:type="paragraph">
@@ -1461,12 +3365,12 @@
       <w:outlineLvl w:val="3"/>
     </w:pPr>
     <w:rPr>
-      <w:rFonts w:asciiTheme="majorHAnsi" w:cstheme="majorBidi" w:eastAsiaTheme="majorEastAsia" w:hAnsiTheme="majorHAnsi"/>
+      <w:rFonts w:ascii="TH Sarabun New" w:cs="TH Sarabun New" w:eastAsia="TH Sarabun New" w:hAnsi="TH Sarabun New"/>
       <w:i/>
+      <w:b/>
       <w:bCs/>
-      <w:color w:themeColor="accent1" w:val="4F81BD"/>
-      <w:sz w:val="24"/>
-      <w:szCs w:val="24"/>
+      <w:sz w:val="32"/>
+      <w:szCs w:val="32"/>
     </w:rPr>
   </w:style>
   <w:style w:styleId="Heading5" w:type="paragraph">
@@ -1483,11 +3387,11 @@
       <w:outlineLvl w:val="4"/>
     </w:pPr>
     <w:rPr>
-      <w:rFonts w:asciiTheme="majorHAnsi" w:cstheme="majorBidi" w:eastAsiaTheme="majorEastAsia" w:hAnsiTheme="majorHAnsi"/>
+      <w:rFonts w:ascii="TH Sarabun New" w:cs="TH Sarabun New" w:eastAsia="TH Sarabun New" w:hAnsi="TH Sarabun New"/>
+      <w:b/>
       <w:iCs/>
-      <w:color w:themeColor="accent1" w:val="4F81BD"/>
-      <w:sz w:val="24"/>
-      <w:szCs w:val="24"/>
+      <w:sz w:val="32"/>
+      <w:szCs w:val="32"/>
     </w:rPr>
   </w:style>
   <w:style w:styleId="Heading6" w:type="paragraph">
@@ -1504,10 +3408,10 @@
       <w:outlineLvl w:val="5"/>
     </w:pPr>
     <w:rPr>
-      <w:rFonts w:asciiTheme="majorHAnsi" w:cstheme="majorBidi" w:eastAsiaTheme="majorEastAsia" w:hAnsiTheme="majorHAnsi"/>
-      <w:color w:themeColor="accent1" w:val="4F81BD"/>
-      <w:sz w:val="24"/>
-      <w:szCs w:val="24"/>
+      <w:rFonts w:ascii="TH Sarabun New" w:cs="TH Sarabun New" w:eastAsia="TH Sarabun New" w:hAnsi="TH Sarabun New"/>
+      <w:b/>
+      <w:sz w:val="32"/>
+      <w:szCs w:val="32"/>
     </w:rPr>
   </w:style>
   <w:style w:styleId="Heading7" w:type="paragraph">
@@ -1524,10 +3428,10 @@
       <w:outlineLvl w:val="6"/>
     </w:pPr>
     <w:rPr>
-      <w:rFonts w:asciiTheme="majorHAnsi" w:cstheme="majorBidi" w:eastAsiaTheme="majorEastAsia" w:hAnsiTheme="majorHAnsi"/>
-      <w:color w:themeColor="accent1" w:val="4F81BD"/>
-      <w:sz w:val="24"/>
-      <w:szCs w:val="24"/>
+      <w:rFonts w:ascii="TH Sarabun New" w:cs="TH Sarabun New" w:eastAsia="TH Sarabun New" w:hAnsi="TH Sarabun New"/>
+      <w:b/>
+      <w:sz w:val="32"/>
+      <w:szCs w:val="32"/>
     </w:rPr>
   </w:style>
   <w:style w:styleId="Heading8" w:type="paragraph">
@@ -1544,10 +3448,10 @@
       <w:outlineLvl w:val="7"/>
     </w:pPr>
     <w:rPr>
-      <w:rFonts w:asciiTheme="majorHAnsi" w:cstheme="majorBidi" w:eastAsiaTheme="majorEastAsia" w:hAnsiTheme="majorHAnsi"/>
-      <w:color w:themeColor="accent1" w:val="4F81BD"/>
-      <w:sz w:val="24"/>
-      <w:szCs w:val="24"/>
+      <w:rFonts w:ascii="TH Sarabun New" w:cs="TH Sarabun New" w:eastAsia="TH Sarabun New" w:hAnsi="TH Sarabun New"/>
+      <w:b/>
+      <w:sz w:val="32"/>
+      <w:szCs w:val="32"/>
     </w:rPr>
   </w:style>
   <w:style w:styleId="Heading9" w:type="paragraph">
@@ -1564,10 +3468,10 @@
       <w:outlineLvl w:val="8"/>
     </w:pPr>
     <w:rPr>
-      <w:rFonts w:asciiTheme="majorHAnsi" w:cstheme="majorBidi" w:eastAsiaTheme="majorEastAsia" w:hAnsiTheme="majorHAnsi"/>
-      <w:color w:themeColor="accent1" w:val="4F81BD"/>
-      <w:sz w:val="24"/>
-      <w:szCs w:val="24"/>
+      <w:rFonts w:ascii="TH Sarabun New" w:cs="TH Sarabun New" w:eastAsia="TH Sarabun New" w:hAnsi="TH Sarabun New"/>
+      <w:b/>
+      <w:sz w:val="32"/>
+      <w:szCs w:val="32"/>
     </w:rPr>
   </w:style>
   <w:style w:styleId="BlockText" w:type="paragraph">
@@ -1581,6 +3485,11 @@
       <w:spacing w:after="100" w:before="100"/>
       <w:ind w:firstLine="0" w:left="480" w:right="480"/>
     </w:pPr>
+    <w:rPr>
+      <w:rFonts w:ascii="TH Sarabun New" w:cs="TH Sarabun New" w:eastAsia="TH Sarabun New" w:hAnsi="TH Sarabun New"/>
+      <w:sz w:val="32"/>
+      <w:szCs w:val="32"/>
+    </w:rPr>
   </w:style>
   <w:style w:styleId="FootnoteText" w:type="paragraph">
     <w:name w:val="Footnote Text"/>
@@ -1589,6 +3498,11 @@
     <w:uiPriority w:val="9"/>
     <w:unhideWhenUsed/>
     <w:qFormat/>
+    <w:rPr>
+      <w:rFonts w:ascii="TH Sarabun New" w:cs="TH Sarabun New" w:eastAsia="TH Sarabun New" w:hAnsi="TH Sarabun New"/>
+      <w:sz w:val="32"/>
+      <w:szCs w:val="32"/>
+    </w:rPr>
   </w:style>
   <w:style w:default="1" w:styleId="DefaultParagraphFont" w:type="character">
     <w:name w:val="Default Paragraph Font"/>
@@ -1637,11 +3551,19 @@
     </w:pPr>
     <w:rPr>
       <w:b/>
+      <w:rFonts w:ascii="TH Sarabun New" w:cs="TH Sarabun New" w:eastAsia="TH Sarabun New" w:hAnsi="TH Sarabun New"/>
+      <w:sz w:val="32"/>
+      <w:szCs w:val="32"/>
     </w:rPr>
   </w:style>
   <w:style w:customStyle="1" w:styleId="Definition" w:type="paragraph">
     <w:name w:val="Definition"/>
     <w:basedOn w:val="Normal"/>
+    <w:rPr>
+      <w:rFonts w:ascii="TH Sarabun New" w:cs="TH Sarabun New" w:eastAsia="TH Sarabun New" w:hAnsi="TH Sarabun New"/>
+      <w:sz w:val="32"/>
+      <w:szCs w:val="32"/>
+    </w:rPr>
   </w:style>
   <w:style w:styleId="Caption" w:type="paragraph">
     <w:name w:val="Caption"/>
@@ -1652,6 +3574,9 @@
     </w:pPr>
     <w:rPr>
       <w:i/>
+      <w:rFonts w:ascii="TH Sarabun New" w:cs="TH Sarabun New" w:eastAsia="TH Sarabun New" w:hAnsi="TH Sarabun New"/>
+      <w:sz w:val="32"/>
+      <w:szCs w:val="32"/>
     </w:rPr>
   </w:style>
   <w:style w:customStyle="1" w:styleId="TableCaption" w:type="paragraph">
@@ -1660,14 +3585,29 @@
     <w:pPr>
       <w:keepNext/>
     </w:pPr>
+    <w:rPr>
+      <w:rFonts w:ascii="TH Sarabun New" w:cs="TH Sarabun New" w:eastAsia="TH Sarabun New" w:hAnsi="TH Sarabun New"/>
+      <w:sz w:val="32"/>
+      <w:szCs w:val="32"/>
+    </w:rPr>
   </w:style>
   <w:style w:customStyle="1" w:styleId="ImageCaption" w:type="paragraph">
     <w:name w:val="Image Caption"/>
     <w:basedOn w:val="Caption"/>
+    <w:rPr>
+      <w:rFonts w:ascii="TH Sarabun New" w:cs="TH Sarabun New" w:eastAsia="TH Sarabun New" w:hAnsi="TH Sarabun New"/>
+      <w:sz w:val="32"/>
+      <w:szCs w:val="32"/>
+    </w:rPr>
   </w:style>
   <w:style w:customStyle="1" w:styleId="Figure" w:type="paragraph">
     <w:name w:val="Figure"/>
     <w:basedOn w:val="Normal"/>
+    <w:rPr>
+      <w:rFonts w:ascii="TH Sarabun New" w:cs="TH Sarabun New" w:eastAsia="TH Sarabun New" w:hAnsi="TH Sarabun New"/>
+      <w:sz w:val="32"/>
+      <w:szCs w:val="32"/>
+    </w:rPr>
   </w:style>
   <w:style w:customStyle="1" w:styleId="CaptionedFigure" w:type="paragraph">
     <w:name w:val="Captioned Figure"/>
@@ -1675,6 +3615,11 @@
     <w:pPr>
       <w:keepNext/>
     </w:pPr>
+    <w:rPr>
+      <w:rFonts w:ascii="TH Sarabun New" w:cs="TH Sarabun New" w:eastAsia="TH Sarabun New" w:hAnsi="TH Sarabun New"/>
+      <w:sz w:val="32"/>
+      <w:szCs w:val="32"/>
+    </w:rPr>
   </w:style>
   <w:style w:customStyle="1" w:styleId="BodyTextChar" w:type="character">
     <w:name w:val="Body Text Char"/>
@@ -1719,10 +3664,12 @@
       <w:outlineLvl w:val="9"/>
     </w:pPr>
     <w:rPr>
-      <w:rFonts w:asciiTheme="majorHAnsi" w:cstheme="majorBidi" w:eastAsiaTheme="majorEastAsia" w:hAnsiTheme="majorHAnsi"/>
+      <w:rFonts w:ascii="TH Sarabun New" w:cs="TH Sarabun New" w:eastAsia="TH Sarabun New" w:hAnsi="TH Sarabun New"/>
       <w:b w:val="0"/>
       <w:bCs w:val="0"/>
       <w:color w:themeColor="accent1" w:themeShade="BF" w:val="365F91"/>
+      <w:sz w:val="32"/>
+      <w:szCs w:val="32"/>
     </w:rPr>
   </w:style>
   <w:style w:type="paragraph" w:customStyle="1" w:styleId="SourceCode">

</xml_diff>